<commit_message>
final project solution commit
</commit_message>
<xml_diff>
--- a/final project/normal_verification/final_project_soln.docx
+++ b/final project/normal_verification/final_project_soln.docx
@@ -7,10 +7,7 @@
         <w:pStyle w:val="Heading1"/>
       </w:pPr>
       <w:r>
-        <w:t>Assignment</w:t>
-      </w:r>
-      <w:r>
-        <w:t>6</w:t>
+        <w:t>Final project</w:t>
       </w:r>
       <w:r>
         <w:t xml:space="preserve"> solution</w:t>
@@ -21,30 +18,27 @@
         <w:pStyle w:val="Heading2"/>
       </w:pPr>
       <w:r>
-        <w:t>ALSU UVM test</w:t>
-      </w:r>
-    </w:p>
-    <w:p>
-      <w:pPr>
-        <w:pStyle w:val="Heading3"/>
-      </w:pPr>
+        <w:t>Verification plan</w:t>
+      </w:r>
+    </w:p>
+    <w:p>
       <w:r>
         <w:rPr>
           <w:noProof/>
         </w:rPr>
         <w:drawing>
-          <wp:anchor distT="0" distB="0" distL="114300" distR="114300" simplePos="0" relativeHeight="251659264" behindDoc="0" locked="0" layoutInCell="1" allowOverlap="1" wp14:anchorId="797DEDF9" wp14:editId="41226D92">
+          <wp:anchor distT="0" distB="0" distL="114300" distR="114300" simplePos="0" relativeHeight="251659264" behindDoc="0" locked="0" layoutInCell="1" allowOverlap="1" wp14:anchorId="139FD2D6" wp14:editId="75681822">
             <wp:simplePos x="0" y="0"/>
-            <wp:positionH relativeFrom="margin">
-              <wp:align>center</wp:align>
+            <wp:positionH relativeFrom="column">
+              <wp:posOffset>0</wp:posOffset>
             </wp:positionH>
             <wp:positionV relativeFrom="paragraph">
-              <wp:posOffset>325120</wp:posOffset>
+              <wp:posOffset>0</wp:posOffset>
             </wp:positionV>
-            <wp:extent cx="4986473" cy="4610100"/>
-            <wp:effectExtent l="0" t="0" r="5080" b="0"/>
+            <wp:extent cx="6629400" cy="4081145"/>
+            <wp:effectExtent l="0" t="0" r="0" b="0"/>
             <wp:wrapNone/>
-            <wp:docPr id="2053577896" name="Picture 1"/>
+            <wp:docPr id="1974553258" name="Picture 1"/>
             <wp:cNvGraphicFramePr>
               <a:graphicFrameLocks xmlns:a="http://schemas.openxmlformats.org/drawingml/2006/main" noChangeAspect="1"/>
             </wp:cNvGraphicFramePr>
@@ -52,11 +46,11 @@
               <a:graphicData uri="http://schemas.openxmlformats.org/drawingml/2006/picture">
                 <pic:pic xmlns:pic="http://schemas.openxmlformats.org/drawingml/2006/picture">
                   <pic:nvPicPr>
-                    <pic:cNvPr id="2053577896" name=""/>
+                    <pic:cNvPr id="1974553258" name=""/>
                     <pic:cNvPicPr/>
                   </pic:nvPicPr>
                   <pic:blipFill>
-                    <a:blip r:embed="rId5"/>
+                    <a:blip r:embed="rId6"/>
                     <a:stretch>
                       <a:fillRect/>
                     </a:stretch>
@@ -64,7 +58,76 @@
                   <pic:spPr>
                     <a:xfrm>
                       <a:off x="0" y="0"/>
-                      <a:ext cx="4986473" cy="4610100"/>
+                      <a:ext cx="6629400" cy="4081145"/>
+                    </a:xfrm>
+                    <a:prstGeom prst="rect">
+                      <a:avLst/>
+                    </a:prstGeom>
+                  </pic:spPr>
+                </pic:pic>
+              </a:graphicData>
+            </a:graphic>
+          </wp:anchor>
+        </w:drawing>
+      </w:r>
+    </w:p>
+    <w:p/>
+    <w:p/>
+    <w:p/>
+    <w:p/>
+    <w:p/>
+    <w:p/>
+    <w:p/>
+    <w:p/>
+    <w:p/>
+    <w:p/>
+    <w:p/>
+    <w:p>
+      <w:pPr>
+        <w:ind w:left="0"/>
+      </w:pPr>
+    </w:p>
+    <w:p>
+      <w:pPr>
+        <w:pStyle w:val="Heading2"/>
+      </w:pPr>
+      <w:r>
+        <w:rPr>
+          <w:noProof/>
+        </w:rPr>
+        <w:drawing>
+          <wp:anchor distT="0" distB="0" distL="114300" distR="114300" simplePos="0" relativeHeight="251661312" behindDoc="0" locked="0" layoutInCell="1" allowOverlap="1" wp14:anchorId="7A34E84E" wp14:editId="136CF1FE">
+            <wp:simplePos x="0" y="0"/>
+            <wp:positionH relativeFrom="margin">
+              <wp:align>center</wp:align>
+            </wp:positionH>
+            <wp:positionV relativeFrom="paragraph">
+              <wp:posOffset>276497</wp:posOffset>
+            </wp:positionV>
+            <wp:extent cx="3548743" cy="4563397"/>
+            <wp:effectExtent l="0" t="0" r="0" b="8890"/>
+            <wp:wrapNone/>
+            <wp:docPr id="1792330224" name="Picture 1"/>
+            <wp:cNvGraphicFramePr>
+              <a:graphicFrameLocks xmlns:a="http://schemas.openxmlformats.org/drawingml/2006/main" noChangeAspect="1"/>
+            </wp:cNvGraphicFramePr>
+            <a:graphic xmlns:a="http://schemas.openxmlformats.org/drawingml/2006/main">
+              <a:graphicData uri="http://schemas.openxmlformats.org/drawingml/2006/picture">
+                <pic:pic xmlns:pic="http://schemas.openxmlformats.org/drawingml/2006/picture">
+                  <pic:nvPicPr>
+                    <pic:cNvPr id="1792330224" name=""/>
+                    <pic:cNvPicPr/>
+                  </pic:nvPicPr>
+                  <pic:blipFill>
+                    <a:blip r:embed="rId7"/>
+                    <a:stretch>
+                      <a:fillRect/>
+                    </a:stretch>
+                  </pic:blipFill>
+                  <pic:spPr>
+                    <a:xfrm>
+                      <a:off x="0" y="0"/>
+                      <a:ext cx="3548743" cy="4563397"/>
                     </a:xfrm>
                     <a:prstGeom prst="rect">
                       <a:avLst/>
@@ -83,35 +146,29 @@
         </w:drawing>
       </w:r>
       <w:r>
-        <w:t>Top module</w:t>
-      </w:r>
-    </w:p>
-    <w:p/>
-    <w:p/>
-    <w:p/>
-    <w:p/>
-    <w:p/>
-    <w:p/>
-    <w:p/>
-    <w:p/>
-    <w:p/>
-    <w:p/>
-    <w:p/>
-    <w:p/>
-    <w:p/>
-    <w:p/>
-    <w:p>
-      <w:pPr>
-        <w:ind w:left="0"/>
-      </w:pPr>
-    </w:p>
-    <w:p>
-      <w:pPr>
-        <w:pStyle w:val="Heading3"/>
-      </w:pPr>
-      <w:r>
-        <w:t>Interface</w:t>
-      </w:r>
+        <w:t>Design file</w:t>
+      </w:r>
+    </w:p>
+    <w:p/>
+    <w:p/>
+    <w:p/>
+    <w:p/>
+    <w:p/>
+    <w:p/>
+    <w:p/>
+    <w:p/>
+    <w:p/>
+    <w:p/>
+    <w:p/>
+    <w:p/>
+    <w:p/>
+    <w:p/>
+    <w:p>
+      <w:pPr>
+        <w:rPr>
+          <w:noProof/>
+        </w:rPr>
+      </w:pPr>
     </w:p>
     <w:p>
       <w:r>
@@ -119,18 +176,18 @@
           <w:noProof/>
         </w:rPr>
         <w:drawing>
-          <wp:anchor distT="0" distB="0" distL="114300" distR="114300" simplePos="0" relativeHeight="251661312" behindDoc="0" locked="0" layoutInCell="1" allowOverlap="1" wp14:anchorId="5925E613" wp14:editId="2AEA79F1">
+          <wp:anchor distT="0" distB="0" distL="114300" distR="114300" simplePos="0" relativeHeight="251663360" behindDoc="0" locked="0" layoutInCell="1" allowOverlap="1" wp14:anchorId="3B2A16F8" wp14:editId="71CD28A9">
             <wp:simplePos x="0" y="0"/>
             <wp:positionH relativeFrom="margin">
               <wp:align>center</wp:align>
             </wp:positionH>
             <wp:positionV relativeFrom="paragraph">
-              <wp:posOffset>70485</wp:posOffset>
+              <wp:posOffset>16510</wp:posOffset>
             </wp:positionV>
-            <wp:extent cx="4373880" cy="3313606"/>
-            <wp:effectExtent l="0" t="0" r="7620" b="1270"/>
+            <wp:extent cx="4453890" cy="3552825"/>
+            <wp:effectExtent l="0" t="0" r="3810" b="9525"/>
             <wp:wrapNone/>
-            <wp:docPr id="1413862261" name="Picture 1"/>
+            <wp:docPr id="1249960204" name="Picture 1"/>
             <wp:cNvGraphicFramePr>
               <a:graphicFrameLocks xmlns:a="http://schemas.openxmlformats.org/drawingml/2006/main" noChangeAspect="1"/>
             </wp:cNvGraphicFramePr>
@@ -138,11 +195,11 @@
               <a:graphicData uri="http://schemas.openxmlformats.org/drawingml/2006/picture">
                 <pic:pic xmlns:pic="http://schemas.openxmlformats.org/drawingml/2006/picture">
                   <pic:nvPicPr>
-                    <pic:cNvPr id="1413862261" name=""/>
+                    <pic:cNvPr id="1249960204" name=""/>
                     <pic:cNvPicPr/>
                   </pic:nvPicPr>
                   <pic:blipFill>
-                    <a:blip r:embed="rId6"/>
+                    <a:blip r:embed="rId8"/>
                     <a:stretch>
                       <a:fillRect/>
                     </a:stretch>
@@ -150,7 +207,7 @@
                   <pic:spPr>
                     <a:xfrm>
                       <a:off x="0" y="0"/>
-                      <a:ext cx="4373880" cy="3313606"/>
+                      <a:ext cx="4453890" cy="3552825"/>
                     </a:xfrm>
                     <a:prstGeom prst="rect">
                       <a:avLst/>
@@ -169,43 +226,24 @@
         </w:drawing>
       </w:r>
     </w:p>
-    <w:p/>
-    <w:p/>
-    <w:p/>
-    <w:p/>
-    <w:p/>
-    <w:p/>
-    <w:p/>
-    <w:p/>
-    <w:p/>
-    <w:p/>
-    <w:p/>
-    <w:p>
-      <w:pPr>
-        <w:pStyle w:val="Heading3"/>
-      </w:pPr>
-      <w:r>
-        <w:t>Shared package</w:t>
-      </w:r>
-    </w:p>
     <w:p>
       <w:r>
         <w:rPr>
           <w:noProof/>
         </w:rPr>
         <w:drawing>
-          <wp:anchor distT="0" distB="0" distL="114300" distR="114300" simplePos="0" relativeHeight="251663360" behindDoc="0" locked="0" layoutInCell="1" allowOverlap="1" wp14:anchorId="39C0D6DD" wp14:editId="58CB5E02">
+          <wp:anchor distT="0" distB="0" distL="114300" distR="114300" simplePos="0" relativeHeight="251665408" behindDoc="0" locked="0" layoutInCell="1" allowOverlap="1" wp14:anchorId="2F59BA8B" wp14:editId="1925D250">
             <wp:simplePos x="0" y="0"/>
             <wp:positionH relativeFrom="margin">
-              <wp:align>center</wp:align>
+              <wp:posOffset>1800225</wp:posOffset>
             </wp:positionH>
             <wp:positionV relativeFrom="paragraph">
-              <wp:posOffset>43815</wp:posOffset>
+              <wp:posOffset>3243468</wp:posOffset>
             </wp:positionV>
-            <wp:extent cx="2049780" cy="2204581"/>
-            <wp:effectExtent l="0" t="0" r="7620" b="5715"/>
+            <wp:extent cx="3021106" cy="2036932"/>
+            <wp:effectExtent l="0" t="0" r="8255" b="1905"/>
             <wp:wrapNone/>
-            <wp:docPr id="294357319" name="Picture 1"/>
+            <wp:docPr id="1216995625" name="Picture 1"/>
             <wp:cNvGraphicFramePr>
               <a:graphicFrameLocks xmlns:a="http://schemas.openxmlformats.org/drawingml/2006/main" noChangeAspect="1"/>
             </wp:cNvGraphicFramePr>
@@ -213,11 +251,11 @@
               <a:graphicData uri="http://schemas.openxmlformats.org/drawingml/2006/picture">
                 <pic:pic xmlns:pic="http://schemas.openxmlformats.org/drawingml/2006/picture">
                   <pic:nvPicPr>
-                    <pic:cNvPr id="294357319" name=""/>
+                    <pic:cNvPr id="1216995625" name=""/>
                     <pic:cNvPicPr/>
                   </pic:nvPicPr>
                   <pic:blipFill>
-                    <a:blip r:embed="rId7"/>
+                    <a:blip r:embed="rId9"/>
                     <a:stretch>
                       <a:fillRect/>
                     </a:stretch>
@@ -225,7 +263,7 @@
                   <pic:spPr>
                     <a:xfrm>
                       <a:off x="0" y="0"/>
-                      <a:ext cx="2049780" cy="2204581"/>
+                      <a:ext cx="3021106" cy="2036932"/>
                     </a:xfrm>
                     <a:prstGeom prst="rect">
                       <a:avLst/>
@@ -251,12 +289,21 @@
     <w:p/>
     <w:p/>
     <w:p/>
-    <w:p>
-      <w:pPr>
-        <w:pStyle w:val="Heading3"/>
-      </w:pPr>
-      <w:r>
-        <w:t>UVM test</w:t>
+    <w:p/>
+    <w:p/>
+    <w:p/>
+    <w:p/>
+    <w:p/>
+    <w:p/>
+    <w:p/>
+    <w:p/>
+    <w:p/>
+    <w:p>
+      <w:pPr>
+        <w:pStyle w:val="Heading2"/>
+      </w:pPr>
+      <w:r>
+        <w:t>TOP</w:t>
       </w:r>
     </w:p>
     <w:p>
@@ -265,18 +312,18 @@
           <w:noProof/>
         </w:rPr>
         <w:drawing>
-          <wp:anchor distT="0" distB="0" distL="114300" distR="114300" simplePos="0" relativeHeight="251665408" behindDoc="0" locked="0" layoutInCell="1" allowOverlap="1" wp14:anchorId="3116699D" wp14:editId="4245D46B">
+          <wp:anchor distT="0" distB="0" distL="114300" distR="114300" simplePos="0" relativeHeight="251667456" behindDoc="0" locked="0" layoutInCell="1" allowOverlap="1" wp14:anchorId="25F83056" wp14:editId="02D502AC">
             <wp:simplePos x="0" y="0"/>
             <wp:positionH relativeFrom="margin">
               <wp:align>center</wp:align>
             </wp:positionH>
             <wp:positionV relativeFrom="paragraph">
-              <wp:posOffset>12065</wp:posOffset>
+              <wp:posOffset>74706</wp:posOffset>
             </wp:positionV>
-            <wp:extent cx="5083792" cy="6419182"/>
-            <wp:effectExtent l="0" t="0" r="3175" b="1270"/>
+            <wp:extent cx="3015759" cy="3335430"/>
+            <wp:effectExtent l="0" t="0" r="0" b="0"/>
             <wp:wrapNone/>
-            <wp:docPr id="211307431" name="Picture 1"/>
+            <wp:docPr id="168249553" name="Picture 1"/>
             <wp:cNvGraphicFramePr>
               <a:graphicFrameLocks xmlns:a="http://schemas.openxmlformats.org/drawingml/2006/main" noChangeAspect="1"/>
             </wp:cNvGraphicFramePr>
@@ -284,11 +331,11 @@
               <a:graphicData uri="http://schemas.openxmlformats.org/drawingml/2006/picture">
                 <pic:pic xmlns:pic="http://schemas.openxmlformats.org/drawingml/2006/picture">
                   <pic:nvPicPr>
-                    <pic:cNvPr id="211307431" name=""/>
+                    <pic:cNvPr id="168249553" name=""/>
                     <pic:cNvPicPr/>
                   </pic:nvPicPr>
                   <pic:blipFill>
-                    <a:blip r:embed="rId8"/>
+                    <a:blip r:embed="rId10"/>
                     <a:stretch>
                       <a:fillRect/>
                     </a:stretch>
@@ -296,7 +343,7 @@
                   <pic:spPr>
                     <a:xfrm>
                       <a:off x="0" y="0"/>
-                      <a:ext cx="5083792" cy="6419182"/>
+                      <a:ext cx="3015759" cy="3335430"/>
                     </a:xfrm>
                     <a:prstGeom prst="rect">
                       <a:avLst/>
@@ -326,41 +373,27 @@
     <w:p/>
     <w:p/>
     <w:p/>
-    <w:p/>
-    <w:p/>
-    <w:p/>
-    <w:p/>
-    <w:p/>
-    <w:p/>
-    <w:p/>
-    <w:p/>
-    <w:p/>
-    <w:p>
-      <w:pPr>
-        <w:pStyle w:val="Heading3"/>
-      </w:pPr>
-      <w:r>
-        <w:t>UVM sequence item</w:t>
-      </w:r>
-    </w:p>
-    <w:p>
+    <w:p>
+      <w:pPr>
+        <w:pStyle w:val="Heading2"/>
+      </w:pPr>
       <w:r>
         <w:rPr>
           <w:noProof/>
         </w:rPr>
         <w:drawing>
-          <wp:anchor distT="0" distB="0" distL="114300" distR="114300" simplePos="0" relativeHeight="251667456" behindDoc="0" locked="0" layoutInCell="1" allowOverlap="1" wp14:anchorId="191ACE05" wp14:editId="345E4420">
+          <wp:anchor distT="0" distB="0" distL="114300" distR="114300" simplePos="0" relativeHeight="251669504" behindDoc="0" locked="0" layoutInCell="1" allowOverlap="1" wp14:anchorId="4F726627" wp14:editId="64DEF52D">
             <wp:simplePos x="0" y="0"/>
-            <wp:positionH relativeFrom="column">
-              <wp:posOffset>0</wp:posOffset>
+            <wp:positionH relativeFrom="margin">
+              <wp:align>center</wp:align>
             </wp:positionH>
             <wp:positionV relativeFrom="paragraph">
-              <wp:posOffset>-635</wp:posOffset>
+              <wp:posOffset>299085</wp:posOffset>
             </wp:positionV>
-            <wp:extent cx="6629400" cy="4834255"/>
-            <wp:effectExtent l="0" t="0" r="0" b="4445"/>
+            <wp:extent cx="1916489" cy="6159500"/>
+            <wp:effectExtent l="0" t="0" r="7620" b="0"/>
             <wp:wrapNone/>
-            <wp:docPr id="455234905" name="Picture 1"/>
+            <wp:docPr id="1937361900" name="Picture 1"/>
             <wp:cNvGraphicFramePr>
               <a:graphicFrameLocks xmlns:a="http://schemas.openxmlformats.org/drawingml/2006/main" noChangeAspect="1"/>
             </wp:cNvGraphicFramePr>
@@ -368,11 +401,11 @@
               <a:graphicData uri="http://schemas.openxmlformats.org/drawingml/2006/picture">
                 <pic:pic xmlns:pic="http://schemas.openxmlformats.org/drawingml/2006/picture">
                   <pic:nvPicPr>
-                    <pic:cNvPr id="455234905" name=""/>
+                    <pic:cNvPr id="1937361900" name=""/>
                     <pic:cNvPicPr/>
                   </pic:nvPicPr>
                   <pic:blipFill>
-                    <a:blip r:embed="rId9"/>
+                    <a:blip r:embed="rId11"/>
                     <a:stretch>
                       <a:fillRect/>
                     </a:stretch>
@@ -380,75 +413,7 @@
                   <pic:spPr>
                     <a:xfrm>
                       <a:off x="0" y="0"/>
-                      <a:ext cx="6629400" cy="4834255"/>
-                    </a:xfrm>
-                    <a:prstGeom prst="rect">
-                      <a:avLst/>
-                    </a:prstGeom>
-                  </pic:spPr>
-                </pic:pic>
-              </a:graphicData>
-            </a:graphic>
-          </wp:anchor>
-        </w:drawing>
-      </w:r>
-    </w:p>
-    <w:p/>
-    <w:p/>
-    <w:p/>
-    <w:p/>
-    <w:p/>
-    <w:p/>
-    <w:p/>
-    <w:p/>
-    <w:p/>
-    <w:p/>
-    <w:p/>
-    <w:p/>
-    <w:p/>
-    <w:p/>
-    <w:p/>
-    <w:p>
-      <w:pPr>
-        <w:pStyle w:val="Heading3"/>
-      </w:pPr>
-      <w:r>
-        <w:rPr>
-          <w:noProof/>
-        </w:rPr>
-        <w:drawing>
-          <wp:anchor distT="0" distB="0" distL="114300" distR="114300" simplePos="0" relativeHeight="251669504" behindDoc="0" locked="0" layoutInCell="1" allowOverlap="1" wp14:anchorId="3CE65BDA" wp14:editId="006B2CA1">
-            <wp:simplePos x="0" y="0"/>
-            <wp:positionH relativeFrom="margin">
-              <wp:align>center</wp:align>
-            </wp:positionH>
-            <wp:positionV relativeFrom="paragraph">
-              <wp:posOffset>263525</wp:posOffset>
-            </wp:positionV>
-            <wp:extent cx="2343068" cy="4026516"/>
-            <wp:effectExtent l="0" t="0" r="635" b="0"/>
-            <wp:wrapNone/>
-            <wp:docPr id="1806261078" name="Picture 1"/>
-            <wp:cNvGraphicFramePr>
-              <a:graphicFrameLocks xmlns:a="http://schemas.openxmlformats.org/drawingml/2006/main" noChangeAspect="1"/>
-            </wp:cNvGraphicFramePr>
-            <a:graphic xmlns:a="http://schemas.openxmlformats.org/drawingml/2006/main">
-              <a:graphicData uri="http://schemas.openxmlformats.org/drawingml/2006/picture">
-                <pic:pic xmlns:pic="http://schemas.openxmlformats.org/drawingml/2006/picture">
-                  <pic:nvPicPr>
-                    <pic:cNvPr id="1806261078" name=""/>
-                    <pic:cNvPicPr/>
-                  </pic:nvPicPr>
-                  <pic:blipFill>
-                    <a:blip r:embed="rId10"/>
-                    <a:stretch>
-                      <a:fillRect/>
-                    </a:stretch>
-                  </pic:blipFill>
-                  <pic:spPr>
-                    <a:xfrm>
-                      <a:off x="0" y="0"/>
-                      <a:ext cx="2343068" cy="4026516"/>
+                      <a:ext cx="1916489" cy="6159500"/>
                     </a:xfrm>
                     <a:prstGeom prst="rect">
                       <a:avLst/>
@@ -467,28 +432,35 @@
         </w:drawing>
       </w:r>
       <w:r>
-        <w:t>UVM sequence</w:t>
-      </w:r>
-    </w:p>
-    <w:p/>
-    <w:p/>
-    <w:p/>
-    <w:p/>
-    <w:p/>
-    <w:p/>
-    <w:p/>
-    <w:p/>
-    <w:p/>
-    <w:p/>
-    <w:p/>
-    <w:p/>
-    <w:p/>
-    <w:p>
-      <w:pPr>
-        <w:pStyle w:val="Heading3"/>
-      </w:pPr>
-      <w:r>
-        <w:t>UVM sequencer</w:t>
+        <w:t>Design interface</w:t>
+      </w:r>
+    </w:p>
+    <w:p/>
+    <w:p/>
+    <w:p/>
+    <w:p/>
+    <w:p/>
+    <w:p/>
+    <w:p/>
+    <w:p/>
+    <w:p/>
+    <w:p/>
+    <w:p/>
+    <w:p/>
+    <w:p/>
+    <w:p/>
+    <w:p/>
+    <w:p/>
+    <w:p/>
+    <w:p/>
+    <w:p/>
+    <w:p/>
+    <w:p>
+      <w:pPr>
+        <w:pStyle w:val="Heading2"/>
+      </w:pPr>
+      <w:r>
+        <w:t>Shared package</w:t>
       </w:r>
     </w:p>
     <w:p>
@@ -497,18 +469,18 @@
           <w:noProof/>
         </w:rPr>
         <w:drawing>
-          <wp:anchor distT="0" distB="0" distL="114300" distR="114300" simplePos="0" relativeHeight="251671552" behindDoc="0" locked="0" layoutInCell="1" allowOverlap="1" wp14:anchorId="4E2580FA" wp14:editId="6C25BF74">
+          <wp:anchor distT="0" distB="0" distL="114300" distR="114300" simplePos="0" relativeHeight="251671552" behindDoc="0" locked="0" layoutInCell="1" allowOverlap="1" wp14:anchorId="7E590259" wp14:editId="043595ED">
             <wp:simplePos x="0" y="0"/>
             <wp:positionH relativeFrom="margin">
               <wp:align>center</wp:align>
             </wp:positionH>
             <wp:positionV relativeFrom="paragraph">
-              <wp:posOffset>73429</wp:posOffset>
+              <wp:posOffset>133350</wp:posOffset>
             </wp:positionV>
-            <wp:extent cx="3943194" cy="1891145"/>
-            <wp:effectExtent l="0" t="0" r="635" b="0"/>
+            <wp:extent cx="3705225" cy="2095500"/>
+            <wp:effectExtent l="0" t="0" r="9525" b="0"/>
             <wp:wrapNone/>
-            <wp:docPr id="1421284198" name="Picture 1"/>
+            <wp:docPr id="858321638" name="Picture 1"/>
             <wp:cNvGraphicFramePr>
               <a:graphicFrameLocks xmlns:a="http://schemas.openxmlformats.org/drawingml/2006/main" noChangeAspect="1"/>
             </wp:cNvGraphicFramePr>
@@ -516,11 +488,11 @@
               <a:graphicData uri="http://schemas.openxmlformats.org/drawingml/2006/picture">
                 <pic:pic xmlns:pic="http://schemas.openxmlformats.org/drawingml/2006/picture">
                   <pic:nvPicPr>
-                    <pic:cNvPr id="1421284198" name=""/>
+                    <pic:cNvPr id="858321638" name=""/>
                     <pic:cNvPicPr/>
                   </pic:nvPicPr>
                   <pic:blipFill>
-                    <a:blip r:embed="rId11"/>
+                    <a:blip r:embed="rId12"/>
                     <a:stretch>
                       <a:fillRect/>
                     </a:stretch>
@@ -528,7 +500,73 @@
                   <pic:spPr>
                     <a:xfrm>
                       <a:off x="0" y="0"/>
-                      <a:ext cx="3943194" cy="1891145"/>
+                      <a:ext cx="3705225" cy="2095500"/>
+                    </a:xfrm>
+                    <a:prstGeom prst="rect">
+                      <a:avLst/>
+                    </a:prstGeom>
+                  </pic:spPr>
+                </pic:pic>
+              </a:graphicData>
+            </a:graphic>
+          </wp:anchor>
+        </w:drawing>
+      </w:r>
+    </w:p>
+    <w:p/>
+    <w:p/>
+    <w:p/>
+    <w:p/>
+    <w:p/>
+    <w:p/>
+    <w:p/>
+    <w:p/>
+    <w:p>
+      <w:pPr>
+        <w:pStyle w:val="Heading2"/>
+      </w:pPr>
+      <w:r>
+        <w:t>Test bench</w:t>
+      </w:r>
+    </w:p>
+    <w:p>
+      <w:r>
+        <w:rPr>
+          <w:noProof/>
+        </w:rPr>
+        <w:drawing>
+          <wp:anchor distT="0" distB="0" distL="114300" distR="114300" simplePos="0" relativeHeight="251673600" behindDoc="0" locked="0" layoutInCell="1" allowOverlap="1" wp14:anchorId="6FA51900" wp14:editId="5EB81262">
+            <wp:simplePos x="0" y="0"/>
+            <wp:positionH relativeFrom="margin">
+              <wp:align>center</wp:align>
+            </wp:positionH>
+            <wp:positionV relativeFrom="paragraph">
+              <wp:posOffset>62230</wp:posOffset>
+            </wp:positionV>
+            <wp:extent cx="3070665" cy="4413250"/>
+            <wp:effectExtent l="0" t="0" r="0" b="6350"/>
+            <wp:wrapNone/>
+            <wp:docPr id="1572051090" name="Picture 1"/>
+            <wp:cNvGraphicFramePr>
+              <a:graphicFrameLocks xmlns:a="http://schemas.openxmlformats.org/drawingml/2006/main" noChangeAspect="1"/>
+            </wp:cNvGraphicFramePr>
+            <a:graphic xmlns:a="http://schemas.openxmlformats.org/drawingml/2006/main">
+              <a:graphicData uri="http://schemas.openxmlformats.org/drawingml/2006/picture">
+                <pic:pic xmlns:pic="http://schemas.openxmlformats.org/drawingml/2006/picture">
+                  <pic:nvPicPr>
+                    <pic:cNvPr id="1572051090" name=""/>
+                    <pic:cNvPicPr/>
+                  </pic:nvPicPr>
+                  <pic:blipFill>
+                    <a:blip r:embed="rId13"/>
+                    <a:stretch>
+                      <a:fillRect/>
+                    </a:stretch>
+                  </pic:blipFill>
+                  <pic:spPr>
+                    <a:xfrm>
+                      <a:off x="0" y="0"/>
+                      <a:ext cx="3070665" cy="4413250"/>
                     </a:xfrm>
                     <a:prstGeom prst="rect">
                       <a:avLst/>
@@ -550,45 +588,43 @@
     <w:p/>
     <w:p/>
     <w:p/>
-    <w:p>
-      <w:pPr>
-        <w:pStyle w:val="Heading3"/>
-        <w:numPr>
-          <w:ilvl w:val="0"/>
-          <w:numId w:val="0"/>
-        </w:numPr>
-        <w:ind w:left="1170"/>
-      </w:pPr>
-    </w:p>
-    <w:p/>
-    <w:p/>
-    <w:p>
-      <w:pPr>
-        <w:pStyle w:val="Heading3"/>
-      </w:pPr>
-      <w:r>
-        <w:t>UVM environment</w:t>
-      </w:r>
-    </w:p>
-    <w:p/>
+    <w:p/>
+    <w:p/>
+    <w:p/>
+    <w:p/>
+    <w:p/>
+    <w:p/>
+    <w:p/>
+    <w:p/>
+    <w:p/>
+    <w:p/>
+    <w:p/>
+    <w:p>
+      <w:pPr>
+        <w:pStyle w:val="Heading2"/>
+      </w:pPr>
+      <w:r>
+        <w:t>FIFO transaction class</w:t>
+      </w:r>
+    </w:p>
     <w:p>
       <w:r>
         <w:rPr>
           <w:noProof/>
         </w:rPr>
         <w:drawing>
-          <wp:anchor distT="0" distB="0" distL="114300" distR="114300" simplePos="0" relativeHeight="251673600" behindDoc="0" locked="0" layoutInCell="1" allowOverlap="1" wp14:anchorId="32618796" wp14:editId="356C2E1C">
+          <wp:anchor distT="0" distB="0" distL="114300" distR="114300" simplePos="0" relativeHeight="251675648" behindDoc="0" locked="0" layoutInCell="1" allowOverlap="1" wp14:anchorId="7DC53FE2" wp14:editId="51F09552">
             <wp:simplePos x="0" y="0"/>
             <wp:positionH relativeFrom="margin">
               <wp:align>center</wp:align>
             </wp:positionH>
             <wp:positionV relativeFrom="paragraph">
-              <wp:posOffset>303530</wp:posOffset>
+              <wp:posOffset>19050</wp:posOffset>
             </wp:positionV>
-            <wp:extent cx="5472545" cy="4736581"/>
-            <wp:effectExtent l="0" t="0" r="0" b="6985"/>
+            <wp:extent cx="3886200" cy="3962400"/>
+            <wp:effectExtent l="0" t="0" r="0" b="0"/>
             <wp:wrapNone/>
-            <wp:docPr id="526112530" name="Picture 1"/>
+            <wp:docPr id="2094727485" name="Picture 1"/>
             <wp:cNvGraphicFramePr>
               <a:graphicFrameLocks xmlns:a="http://schemas.openxmlformats.org/drawingml/2006/main" noChangeAspect="1"/>
             </wp:cNvGraphicFramePr>
@@ -596,11 +632,11 @@
               <a:graphicData uri="http://schemas.openxmlformats.org/drawingml/2006/picture">
                 <pic:pic xmlns:pic="http://schemas.openxmlformats.org/drawingml/2006/picture">
                   <pic:nvPicPr>
-                    <pic:cNvPr id="526112530" name=""/>
+                    <pic:cNvPr id="2094727485" name=""/>
                     <pic:cNvPicPr/>
                   </pic:nvPicPr>
                   <pic:blipFill>
-                    <a:blip r:embed="rId12"/>
+                    <a:blip r:embed="rId14"/>
                     <a:stretch>
                       <a:fillRect/>
                     </a:stretch>
@@ -608,7 +644,7 @@
                   <pic:spPr>
                     <a:xfrm>
                       <a:off x="0" y="0"/>
-                      <a:ext cx="5472545" cy="4736581"/>
+                      <a:ext cx="3886200" cy="3962400"/>
                     </a:xfrm>
                     <a:prstGeom prst="rect">
                       <a:avLst/>
@@ -640,36 +676,12 @@
     <w:p/>
     <w:p/>
     <w:p/>
-    <w:p/>
-    <w:p/>
-    <w:p/>
-    <w:p/>
-    <w:p>
-      <w:pPr>
-        <w:ind w:firstLine="720"/>
-      </w:pPr>
-    </w:p>
-    <w:p>
-      <w:pPr>
-        <w:ind w:firstLine="720"/>
-      </w:pPr>
-    </w:p>
-    <w:p>
-      <w:pPr>
-        <w:ind w:firstLine="720"/>
-      </w:pPr>
-    </w:p>
-    <w:p>
-      <w:pPr>
-        <w:ind w:firstLine="720"/>
-      </w:pPr>
-    </w:p>
-    <w:p>
-      <w:pPr>
-        <w:pStyle w:val="Heading3"/>
-      </w:pPr>
-      <w:r>
-        <w:t>UVM coverage collector</w:t>
+    <w:p>
+      <w:pPr>
+        <w:pStyle w:val="Heading2"/>
+      </w:pPr>
+      <w:r>
+        <w:t>FIFO scoreboard</w:t>
       </w:r>
     </w:p>
     <w:p>
@@ -678,7 +690,7 @@
           <w:noProof/>
         </w:rPr>
         <w:drawing>
-          <wp:anchor distT="0" distB="0" distL="114300" distR="114300" simplePos="0" relativeHeight="251675648" behindDoc="0" locked="0" layoutInCell="1" allowOverlap="1" wp14:anchorId="69CDB452" wp14:editId="138B9AAA">
+          <wp:anchor distT="0" distB="0" distL="114300" distR="114300" simplePos="0" relativeHeight="251677696" behindDoc="0" locked="0" layoutInCell="1" allowOverlap="1" wp14:anchorId="02639D3A" wp14:editId="42937411">
             <wp:simplePos x="0" y="0"/>
             <wp:positionH relativeFrom="column">
               <wp:posOffset>0</wp:posOffset>
@@ -686,10 +698,10 @@
             <wp:positionV relativeFrom="paragraph">
               <wp:posOffset>-635</wp:posOffset>
             </wp:positionV>
-            <wp:extent cx="6629400" cy="7272655"/>
-            <wp:effectExtent l="0" t="0" r="0" b="4445"/>
+            <wp:extent cx="6629400" cy="4933950"/>
+            <wp:effectExtent l="0" t="0" r="0" b="0"/>
             <wp:wrapNone/>
-            <wp:docPr id="787818879" name="Picture 1"/>
+            <wp:docPr id="143372422" name="Picture 1"/>
             <wp:cNvGraphicFramePr>
               <a:graphicFrameLocks xmlns:a="http://schemas.openxmlformats.org/drawingml/2006/main" noChangeAspect="1"/>
             </wp:cNvGraphicFramePr>
@@ -697,11 +709,11 @@
               <a:graphicData uri="http://schemas.openxmlformats.org/drawingml/2006/picture">
                 <pic:pic xmlns:pic="http://schemas.openxmlformats.org/drawingml/2006/picture">
                   <pic:nvPicPr>
-                    <pic:cNvPr id="787818879" name=""/>
+                    <pic:cNvPr id="143372422" name=""/>
                     <pic:cNvPicPr/>
                   </pic:nvPicPr>
                   <pic:blipFill>
-                    <a:blip r:embed="rId13"/>
+                    <a:blip r:embed="rId15"/>
                     <a:stretch>
                       <a:fillRect/>
                     </a:stretch>
@@ -709,7 +721,7 @@
                   <pic:spPr>
                     <a:xfrm>
                       <a:off x="0" y="0"/>
-                      <a:ext cx="6629400" cy="7272655"/>
+                      <a:ext cx="6629400" cy="4933950"/>
                     </a:xfrm>
                     <a:prstGeom prst="rect">
                       <a:avLst/>
@@ -722,57 +734,47 @@
         </w:drawing>
       </w:r>
     </w:p>
-    <w:p>
-      <w:pPr>
-        <w:ind w:firstLine="720"/>
-      </w:pPr>
-    </w:p>
-    <w:p/>
-    <w:p/>
-    <w:p/>
-    <w:p/>
-    <w:p/>
-    <w:p/>
-    <w:p/>
-    <w:p/>
-    <w:p/>
-    <w:p/>
-    <w:p/>
-    <w:p/>
-    <w:p/>
-    <w:p/>
-    <w:p/>
-    <w:p/>
-    <w:p/>
-    <w:p/>
-    <w:p/>
-    <w:p/>
-    <w:p/>
-    <w:p/>
-    <w:p/>
-    <w:p/>
-    <w:p/>
-    <w:p/>
-    <w:p/>
+    <w:p/>
+    <w:p/>
+    <w:p/>
+    <w:p/>
+    <w:p/>
+    <w:p/>
+    <w:p/>
+    <w:p/>
+    <w:p/>
+    <w:p/>
+    <w:p/>
+    <w:p/>
+    <w:p/>
+    <w:p/>
+    <w:p/>
+    <w:p>
+      <w:pPr>
+        <w:pStyle w:val="Heading2"/>
+      </w:pPr>
+      <w:r>
+        <w:t>FIFO coverage class</w:t>
+      </w:r>
+    </w:p>
     <w:p>
       <w:r>
         <w:rPr>
           <w:noProof/>
         </w:rPr>
-        <w:lastRenderedPageBreak/>
         <w:drawing>
-          <wp:anchor distT="0" distB="0" distL="114300" distR="114300" simplePos="0" relativeHeight="251677696" behindDoc="0" locked="0" layoutInCell="1" allowOverlap="1" wp14:anchorId="151127C6" wp14:editId="68BAE5FB">
+          <wp:anchor distT="0" distB="0" distL="114300" distR="114300" simplePos="0" relativeHeight="251679744" behindDoc="0" locked="0" layoutInCell="1" allowOverlap="1" wp14:anchorId="48DB2B18" wp14:editId="1B110B91">
             <wp:simplePos x="0" y="0"/>
-            <wp:positionH relativeFrom="margin">
-              <wp:align>center</wp:align>
+            <wp:positionH relativeFrom="column">
+              <wp:posOffset>0</wp:posOffset>
             </wp:positionH>
             <wp:positionV relativeFrom="paragraph">
-              <wp:posOffset>166543</wp:posOffset>
+              <wp:posOffset>-635</wp:posOffset>
             </wp:positionV>
-            <wp:extent cx="6629400" cy="3995420"/>
-            <wp:effectExtent l="0" t="0" r="0" b="5080"/>
+            <wp:extent cx="6629400" cy="3237865"/>
+            <wp:effectExtent l="0" t="0" r="0" b="635"/>
             <wp:wrapNone/>
-            <wp:docPr id="635196554" name="Picture 1"/>
+            <wp:docPr id="897217518" name="Picture 1"/>
             <wp:cNvGraphicFramePr>
               <a:graphicFrameLocks xmlns:a="http://schemas.openxmlformats.org/drawingml/2006/main" noChangeAspect="1"/>
             </wp:cNvGraphicFramePr>
@@ -780,11 +782,11 @@
               <a:graphicData uri="http://schemas.openxmlformats.org/drawingml/2006/picture">
                 <pic:pic xmlns:pic="http://schemas.openxmlformats.org/drawingml/2006/picture">
                   <pic:nvPicPr>
-                    <pic:cNvPr id="635196554" name=""/>
+                    <pic:cNvPr id="897217518" name=""/>
                     <pic:cNvPicPr/>
                   </pic:nvPicPr>
                   <pic:blipFill>
-                    <a:blip r:embed="rId14"/>
+                    <a:blip r:embed="rId16"/>
                     <a:stretch>
                       <a:fillRect/>
                     </a:stretch>
@@ -792,7 +794,223 @@
                   <pic:spPr>
                     <a:xfrm>
                       <a:off x="0" y="0"/>
-                      <a:ext cx="6629400" cy="3995420"/>
+                      <a:ext cx="6629400" cy="3237865"/>
+                    </a:xfrm>
+                    <a:prstGeom prst="rect">
+                      <a:avLst/>
+                    </a:prstGeom>
+                  </pic:spPr>
+                </pic:pic>
+              </a:graphicData>
+            </a:graphic>
+          </wp:anchor>
+        </w:drawing>
+      </w:r>
+    </w:p>
+    <w:p/>
+    <w:p/>
+    <w:p/>
+    <w:p/>
+    <w:p/>
+    <w:p/>
+    <w:p/>
+    <w:p/>
+    <w:p/>
+    <w:p/>
+    <w:p/>
+    <w:p/>
+    <w:p>
+      <w:pPr>
+        <w:pStyle w:val="Heading2"/>
+      </w:pPr>
+      <w:r>
+        <w:t>Monitor</w:t>
+      </w:r>
+    </w:p>
+    <w:p>
+      <w:r>
+        <w:rPr>
+          <w:noProof/>
+        </w:rPr>
+        <w:drawing>
+          <wp:anchor distT="0" distB="0" distL="114300" distR="114300" simplePos="0" relativeHeight="251681792" behindDoc="0" locked="0" layoutInCell="1" allowOverlap="1" wp14:anchorId="3168924A" wp14:editId="13C0DC3B">
+            <wp:simplePos x="0" y="0"/>
+            <wp:positionH relativeFrom="column">
+              <wp:posOffset>0</wp:posOffset>
+            </wp:positionH>
+            <wp:positionV relativeFrom="paragraph">
+              <wp:posOffset>-635</wp:posOffset>
+            </wp:positionV>
+            <wp:extent cx="6629400" cy="6305550"/>
+            <wp:effectExtent l="0" t="0" r="0" b="0"/>
+            <wp:wrapNone/>
+            <wp:docPr id="1906026627" name="Picture 1"/>
+            <wp:cNvGraphicFramePr>
+              <a:graphicFrameLocks xmlns:a="http://schemas.openxmlformats.org/drawingml/2006/main" noChangeAspect="1"/>
+            </wp:cNvGraphicFramePr>
+            <a:graphic xmlns:a="http://schemas.openxmlformats.org/drawingml/2006/main">
+              <a:graphicData uri="http://schemas.openxmlformats.org/drawingml/2006/picture">
+                <pic:pic xmlns:pic="http://schemas.openxmlformats.org/drawingml/2006/picture">
+                  <pic:nvPicPr>
+                    <pic:cNvPr id="1906026627" name=""/>
+                    <pic:cNvPicPr/>
+                  </pic:nvPicPr>
+                  <pic:blipFill>
+                    <a:blip r:embed="rId17"/>
+                    <a:stretch>
+                      <a:fillRect/>
+                    </a:stretch>
+                  </pic:blipFill>
+                  <pic:spPr>
+                    <a:xfrm>
+                      <a:off x="0" y="0"/>
+                      <a:ext cx="6629400" cy="6305550"/>
+                    </a:xfrm>
+                    <a:prstGeom prst="rect">
+                      <a:avLst/>
+                    </a:prstGeom>
+                  </pic:spPr>
+                </pic:pic>
+              </a:graphicData>
+            </a:graphic>
+          </wp:anchor>
+        </w:drawing>
+      </w:r>
+    </w:p>
+    <w:p/>
+    <w:p/>
+    <w:p/>
+    <w:p/>
+    <w:p/>
+    <w:p/>
+    <w:p/>
+    <w:p/>
+    <w:p/>
+    <w:p/>
+    <w:p/>
+    <w:p/>
+    <w:p/>
+    <w:p/>
+    <w:p/>
+    <w:p/>
+    <w:p/>
+    <w:p/>
+    <w:p/>
+    <w:p/>
+    <w:p>
+      <w:pPr>
+        <w:pStyle w:val="Heading2"/>
+      </w:pPr>
+      <w:r>
+        <w:t>Do file</w:t>
+      </w:r>
+    </w:p>
+    <w:p>
+      <w:r>
+        <w:rPr>
+          <w:noProof/>
+        </w:rPr>
+        <w:drawing>
+          <wp:anchor distT="0" distB="0" distL="114300" distR="114300" simplePos="0" relativeHeight="251683840" behindDoc="0" locked="0" layoutInCell="1" allowOverlap="1" wp14:anchorId="75825250" wp14:editId="239CD02F">
+            <wp:simplePos x="0" y="0"/>
+            <wp:positionH relativeFrom="column">
+              <wp:posOffset>0</wp:posOffset>
+            </wp:positionH>
+            <wp:positionV relativeFrom="paragraph">
+              <wp:posOffset>-635</wp:posOffset>
+            </wp:positionV>
+            <wp:extent cx="6629400" cy="1562100"/>
+            <wp:effectExtent l="0" t="0" r="0" b="0"/>
+            <wp:wrapNone/>
+            <wp:docPr id="1560476943" name="Picture 1"/>
+            <wp:cNvGraphicFramePr>
+              <a:graphicFrameLocks xmlns:a="http://schemas.openxmlformats.org/drawingml/2006/main" noChangeAspect="1"/>
+            </wp:cNvGraphicFramePr>
+            <a:graphic xmlns:a="http://schemas.openxmlformats.org/drawingml/2006/main">
+              <a:graphicData uri="http://schemas.openxmlformats.org/drawingml/2006/picture">
+                <pic:pic xmlns:pic="http://schemas.openxmlformats.org/drawingml/2006/picture">
+                  <pic:nvPicPr>
+                    <pic:cNvPr id="1560476943" name=""/>
+                    <pic:cNvPicPr/>
+                  </pic:nvPicPr>
+                  <pic:blipFill>
+                    <a:blip r:embed="rId18"/>
+                    <a:stretch>
+                      <a:fillRect/>
+                    </a:stretch>
+                  </pic:blipFill>
+                  <pic:spPr>
+                    <a:xfrm>
+                      <a:off x="0" y="0"/>
+                      <a:ext cx="6629400" cy="1562100"/>
+                    </a:xfrm>
+                    <a:prstGeom prst="rect">
+                      <a:avLst/>
+                    </a:prstGeom>
+                  </pic:spPr>
+                </pic:pic>
+              </a:graphicData>
+            </a:graphic>
+          </wp:anchor>
+        </w:drawing>
+      </w:r>
+    </w:p>
+    <w:p/>
+    <w:p/>
+    <w:p/>
+    <w:p/>
+    <w:p/>
+    <w:p/>
+    <w:p/>
+    <w:p>
+      <w:pPr>
+        <w:pStyle w:val="Heading2"/>
+      </w:pPr>
+      <w:r>
+        <w:t>Simulation results</w:t>
+      </w:r>
+    </w:p>
+    <w:p>
+      <w:pPr>
+        <w:pStyle w:val="Heading3"/>
+      </w:pPr>
+      <w:r>
+        <w:rPr>
+          <w:noProof/>
+        </w:rPr>
+        <w:drawing>
+          <wp:anchor distT="0" distB="0" distL="114300" distR="114300" simplePos="0" relativeHeight="251685888" behindDoc="0" locked="0" layoutInCell="1" allowOverlap="1" wp14:anchorId="5B274CC5" wp14:editId="4494DB85">
+            <wp:simplePos x="0" y="0"/>
+            <wp:positionH relativeFrom="margin">
+              <wp:align>center</wp:align>
+            </wp:positionH>
+            <wp:positionV relativeFrom="paragraph">
+              <wp:posOffset>322580</wp:posOffset>
+            </wp:positionV>
+            <wp:extent cx="5861050" cy="2196210"/>
+            <wp:effectExtent l="0" t="0" r="6350" b="0"/>
+            <wp:wrapNone/>
+            <wp:docPr id="1395558851" name="Picture 1"/>
+            <wp:cNvGraphicFramePr>
+              <a:graphicFrameLocks xmlns:a="http://schemas.openxmlformats.org/drawingml/2006/main" noChangeAspect="1"/>
+            </wp:cNvGraphicFramePr>
+            <a:graphic xmlns:a="http://schemas.openxmlformats.org/drawingml/2006/main">
+              <a:graphicData uri="http://schemas.openxmlformats.org/drawingml/2006/picture">
+                <pic:pic xmlns:pic="http://schemas.openxmlformats.org/drawingml/2006/picture">
+                  <pic:nvPicPr>
+                    <pic:cNvPr id="1395558851" name=""/>
+                    <pic:cNvPicPr/>
+                  </pic:nvPicPr>
+                  <pic:blipFill>
+                    <a:blip r:embed="rId19"/>
+                    <a:stretch>
+                      <a:fillRect/>
+                    </a:stretch>
+                  </pic:blipFill>
+                  <pic:spPr>
+                    <a:xfrm>
+                      <a:off x="0" y="0"/>
+                      <a:ext cx="5861050" cy="2196210"/>
                     </a:xfrm>
                     <a:prstGeom prst="rect">
                       <a:avLst/>
@@ -810,13 +1028,10 @@
           </wp:anchor>
         </w:drawing>
       </w:r>
-    </w:p>
-    <w:p/>
-    <w:p/>
-    <w:p/>
-    <w:p/>
-    <w:p/>
-    <w:p/>
+      <w:r>
+        <w:t>Assertion results</w:t>
+      </w:r>
+    </w:p>
     <w:p/>
     <w:p/>
     <w:p/>
@@ -829,32 +1044,27 @@
         <w:pStyle w:val="Heading3"/>
       </w:pPr>
       <w:r>
-        <w:t>UVM agent</w:t>
-      </w:r>
-    </w:p>
-    <w:p>
-      <w:pPr>
-        <w:tabs>
-          <w:tab w:val="left" w:pos="1604"/>
-        </w:tabs>
-      </w:pPr>
+        <w:t>Output against golden model summary results</w:t>
+      </w:r>
+    </w:p>
+    <w:p>
       <w:r>
         <w:rPr>
           <w:noProof/>
         </w:rPr>
         <w:drawing>
-          <wp:anchor distT="0" distB="0" distL="114300" distR="114300" simplePos="0" relativeHeight="251679744" behindDoc="0" locked="0" layoutInCell="1" allowOverlap="1" wp14:anchorId="2CAD0CC6" wp14:editId="65F8B365">
+          <wp:anchor distT="0" distB="0" distL="114300" distR="114300" simplePos="0" relativeHeight="251687936" behindDoc="0" locked="0" layoutInCell="1" allowOverlap="1" wp14:anchorId="6BDF22E4" wp14:editId="6E65BE07">
             <wp:simplePos x="0" y="0"/>
-            <wp:positionH relativeFrom="column">
-              <wp:posOffset>1412644</wp:posOffset>
+            <wp:positionH relativeFrom="margin">
+              <wp:align>center</wp:align>
             </wp:positionH>
             <wp:positionV relativeFrom="paragraph">
-              <wp:posOffset>61711</wp:posOffset>
+              <wp:posOffset>38100</wp:posOffset>
             </wp:positionV>
-            <wp:extent cx="4156363" cy="5181017"/>
-            <wp:effectExtent l="0" t="0" r="0" b="635"/>
+            <wp:extent cx="5324475" cy="1285875"/>
+            <wp:effectExtent l="0" t="0" r="9525" b="9525"/>
             <wp:wrapNone/>
-            <wp:docPr id="311870385" name="Picture 1"/>
+            <wp:docPr id="1245302310" name="Picture 1"/>
             <wp:cNvGraphicFramePr>
               <a:graphicFrameLocks xmlns:a="http://schemas.openxmlformats.org/drawingml/2006/main" noChangeAspect="1"/>
             </wp:cNvGraphicFramePr>
@@ -862,11 +1072,11 @@
               <a:graphicData uri="http://schemas.openxmlformats.org/drawingml/2006/picture">
                 <pic:pic xmlns:pic="http://schemas.openxmlformats.org/drawingml/2006/picture">
                   <pic:nvPicPr>
-                    <pic:cNvPr id="311870385" name=""/>
+                    <pic:cNvPr id="1245302310" name=""/>
                     <pic:cNvPicPr/>
                   </pic:nvPicPr>
                   <pic:blipFill>
-                    <a:blip r:embed="rId15"/>
+                    <a:blip r:embed="rId20"/>
                     <a:stretch>
                       <a:fillRect/>
                     </a:stretch>
@@ -874,7 +1084,69 @@
                   <pic:spPr>
                     <a:xfrm>
                       <a:off x="0" y="0"/>
-                      <a:ext cx="4156363" cy="5181017"/>
+                      <a:ext cx="5324475" cy="1285875"/>
+                    </a:xfrm>
+                    <a:prstGeom prst="rect">
+                      <a:avLst/>
+                    </a:prstGeom>
+                  </pic:spPr>
+                </pic:pic>
+              </a:graphicData>
+            </a:graphic>
+          </wp:anchor>
+        </w:drawing>
+      </w:r>
+    </w:p>
+    <w:p/>
+    <w:p/>
+    <w:p/>
+    <w:p/>
+    <w:p>
+      <w:pPr>
+        <w:pStyle w:val="Heading3"/>
+      </w:pPr>
+      <w:r>
+        <w:t>An error stimulus test case</w:t>
+      </w:r>
+    </w:p>
+    <w:p>
+      <w:r>
+        <w:rPr>
+          <w:noProof/>
+        </w:rPr>
+        <w:drawing>
+          <wp:anchor distT="0" distB="0" distL="114300" distR="114300" simplePos="0" relativeHeight="251689984" behindDoc="0" locked="0" layoutInCell="1" allowOverlap="1" wp14:anchorId="69256FD3" wp14:editId="53A9A60B">
+            <wp:simplePos x="0" y="0"/>
+            <wp:positionH relativeFrom="margin">
+              <wp:align>left</wp:align>
+            </wp:positionH>
+            <wp:positionV relativeFrom="paragraph">
+              <wp:posOffset>160020</wp:posOffset>
+            </wp:positionV>
+            <wp:extent cx="3244850" cy="4159264"/>
+            <wp:effectExtent l="0" t="0" r="0" b="0"/>
+            <wp:wrapNone/>
+            <wp:docPr id="1659844598" name="Picture 1"/>
+            <wp:cNvGraphicFramePr>
+              <a:graphicFrameLocks xmlns:a="http://schemas.openxmlformats.org/drawingml/2006/main" noChangeAspect="1"/>
+            </wp:cNvGraphicFramePr>
+            <a:graphic xmlns:a="http://schemas.openxmlformats.org/drawingml/2006/main">
+              <a:graphicData uri="http://schemas.openxmlformats.org/drawingml/2006/picture">
+                <pic:pic xmlns:pic="http://schemas.openxmlformats.org/drawingml/2006/picture">
+                  <pic:nvPicPr>
+                    <pic:cNvPr id="1659844598" name=""/>
+                    <pic:cNvPicPr/>
+                  </pic:nvPicPr>
+                  <pic:blipFill>
+                    <a:blip r:embed="rId21"/>
+                    <a:stretch>
+                      <a:fillRect/>
+                    </a:stretch>
+                  </pic:blipFill>
+                  <pic:spPr>
+                    <a:xfrm>
+                      <a:off x="0" y="0"/>
+                      <a:ext cx="3244850" cy="4159264"/>
                     </a:xfrm>
                     <a:prstGeom prst="rect">
                       <a:avLst/>
@@ -892,52 +1164,27 @@
           </wp:anchor>
         </w:drawing>
       </w:r>
-      <w:r>
-        <w:tab/>
-      </w:r>
-    </w:p>
-    <w:p/>
-    <w:p/>
-    <w:p/>
-    <w:p/>
-    <w:p/>
-    <w:p/>
-    <w:p/>
-    <w:p/>
-    <w:p/>
-    <w:p/>
-    <w:p/>
-    <w:p/>
-    <w:p/>
-    <w:p/>
-    <w:p/>
-    <w:p/>
-    <w:p>
-      <w:pPr>
-        <w:pStyle w:val="Heading3"/>
-      </w:pPr>
-      <w:r>
-        <w:t>UVM driver</w:t>
-      </w:r>
-    </w:p>
+    </w:p>
+    <w:p/>
+    <w:p/>
     <w:p>
       <w:r>
         <w:rPr>
           <w:noProof/>
         </w:rPr>
         <w:drawing>
-          <wp:anchor distT="0" distB="0" distL="114300" distR="114300" simplePos="0" relativeHeight="251681792" behindDoc="0" locked="0" layoutInCell="1" allowOverlap="1" wp14:anchorId="523C6031" wp14:editId="5E3F2055">
+          <wp:anchor distT="0" distB="0" distL="114300" distR="114300" simplePos="0" relativeHeight="251693056" behindDoc="0" locked="0" layoutInCell="1" allowOverlap="1" wp14:anchorId="22657044" wp14:editId="26827220">
             <wp:simplePos x="0" y="0"/>
             <wp:positionH relativeFrom="margin">
-              <wp:align>center</wp:align>
+              <wp:posOffset>3873500</wp:posOffset>
             </wp:positionH>
             <wp:positionV relativeFrom="paragraph">
-              <wp:posOffset>3810</wp:posOffset>
+              <wp:posOffset>199390</wp:posOffset>
             </wp:positionV>
-            <wp:extent cx="3629891" cy="3992330"/>
-            <wp:effectExtent l="0" t="0" r="8890" b="8255"/>
+            <wp:extent cx="2837329" cy="1867365"/>
+            <wp:effectExtent l="0" t="0" r="1270" b="0"/>
             <wp:wrapNone/>
-            <wp:docPr id="1965017077" name="Picture 1"/>
+            <wp:docPr id="1458350503" name="Picture 1"/>
             <wp:cNvGraphicFramePr>
               <a:graphicFrameLocks xmlns:a="http://schemas.openxmlformats.org/drawingml/2006/main" noChangeAspect="1"/>
             </wp:cNvGraphicFramePr>
@@ -945,11 +1192,11 @@
               <a:graphicData uri="http://schemas.openxmlformats.org/drawingml/2006/picture">
                 <pic:pic xmlns:pic="http://schemas.openxmlformats.org/drawingml/2006/picture">
                   <pic:nvPicPr>
-                    <pic:cNvPr id="1965017077" name=""/>
+                    <pic:cNvPr id="1458350503" name=""/>
                     <pic:cNvPicPr/>
                   </pic:nvPicPr>
                   <pic:blipFill>
-                    <a:blip r:embed="rId16"/>
+                    <a:blip r:embed="rId22"/>
                     <a:stretch>
                       <a:fillRect/>
                     </a:stretch>
@@ -957,7 +1204,7 @@
                   <pic:spPr>
                     <a:xfrm>
                       <a:off x="0" y="0"/>
-                      <a:ext cx="3629891" cy="3992330"/>
+                      <a:ext cx="2837329" cy="1867365"/>
                     </a:xfrm>
                     <a:prstGeom prst="rect">
                       <a:avLst/>
@@ -978,41 +1225,162 @@
     </w:p>
     <w:p/>
     <w:p/>
-    <w:p/>
-    <w:p/>
-    <w:p/>
-    <w:p/>
-    <w:p/>
-    <w:p/>
-    <w:p/>
-    <w:p/>
-    <w:p>
-      <w:pPr>
-        <w:ind w:left="0"/>
-      </w:pPr>
-    </w:p>
-    <w:p/>
+    <w:p>
+      <w:r>
+        <w:rPr>
+          <w:noProof/>
+        </w:rPr>
+        <mc:AlternateContent>
+          <mc:Choice Requires="wps">
+            <w:drawing>
+              <wp:anchor distT="0" distB="0" distL="114300" distR="114300" simplePos="0" relativeHeight="251691008" behindDoc="0" locked="0" layoutInCell="1" allowOverlap="1" wp14:anchorId="138337A8" wp14:editId="42A3FF66">
+                <wp:simplePos x="0" y="0"/>
+                <wp:positionH relativeFrom="column">
+                  <wp:posOffset>3067050</wp:posOffset>
+                </wp:positionH>
+                <wp:positionV relativeFrom="paragraph">
+                  <wp:posOffset>194310</wp:posOffset>
+                </wp:positionV>
+                <wp:extent cx="723900" cy="0"/>
+                <wp:effectExtent l="0" t="76200" r="19050" b="95250"/>
+                <wp:wrapNone/>
+                <wp:docPr id="1504230099" name="Straight Arrow Connector 2"/>
+                <wp:cNvGraphicFramePr/>
+                <a:graphic xmlns:a="http://schemas.openxmlformats.org/drawingml/2006/main">
+                  <a:graphicData uri="http://schemas.microsoft.com/office/word/2010/wordprocessingShape">
+                    <wps:wsp>
+                      <wps:cNvCnPr/>
+                      <wps:spPr>
+                        <a:xfrm>
+                          <a:off x="0" y="0"/>
+                          <a:ext cx="723900" cy="0"/>
+                        </a:xfrm>
+                        <a:prstGeom prst="straightConnector1">
+                          <a:avLst/>
+                        </a:prstGeom>
+                        <a:ln>
+                          <a:tailEnd type="triangle"/>
+                        </a:ln>
+                      </wps:spPr>
+                      <wps:style>
+                        <a:lnRef idx="2">
+                          <a:schemeClr val="accent1"/>
+                        </a:lnRef>
+                        <a:fillRef idx="0">
+                          <a:schemeClr val="accent1"/>
+                        </a:fillRef>
+                        <a:effectRef idx="1">
+                          <a:schemeClr val="accent1"/>
+                        </a:effectRef>
+                        <a:fontRef idx="minor">
+                          <a:schemeClr val="tx1"/>
+                        </a:fontRef>
+                      </wps:style>
+                      <wps:bodyPr/>
+                    </wps:wsp>
+                  </a:graphicData>
+                </a:graphic>
+                <wp14:sizeRelH relativeFrom="margin">
+                  <wp14:pctWidth>0</wp14:pctWidth>
+                </wp14:sizeRelH>
+                <wp14:sizeRelV relativeFrom="margin">
+                  <wp14:pctHeight>0</wp14:pctHeight>
+                </wp14:sizeRelV>
+              </wp:anchor>
+            </w:drawing>
+          </mc:Choice>
+          <mc:Fallback>
+            <w:pict>
+              <v:shapetype w14:anchorId="64AFD67B" id="_x0000_t32" coordsize="21600,21600" o:spt="32" o:oned="t" path="m,l21600,21600e" filled="f">
+                <v:path arrowok="t" fillok="f" o:connecttype="none"/>
+                <o:lock v:ext="edit" shapetype="t"/>
+              </v:shapetype>
+              <v:shape id="Straight Arrow Connector 2" o:spid="_x0000_s1026" type="#_x0000_t32" style="position:absolute;left:0;text-align:left;margin-left:241.5pt;margin-top:15.3pt;width:57pt;height:0;z-index:251691008;visibility:visible;mso-wrap-style:square;mso-width-percent:0;mso-height-percent:0;mso-wrap-distance-left:9pt;mso-wrap-distance-top:0;mso-wrap-distance-right:9pt;mso-wrap-distance-bottom:0;mso-position-horizontal:absolute;mso-position-horizontal-relative:text;mso-position-vertical:absolute;mso-position-vertical-relative:text;mso-width-percent:0;mso-height-percent:0;mso-width-relative:margin;mso-height-relative:margin" o:gfxdata="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" strokecolor="#156082 [3204]" strokeweight="1.5pt">
+                <v:stroke endarrow="block" joinstyle="miter"/>
+              </v:shape>
+            </w:pict>
+          </mc:Fallback>
+        </mc:AlternateContent>
+      </w:r>
+    </w:p>
+    <w:p/>
+    <w:p/>
+    <w:p/>
+    <w:p/>
+    <w:p/>
+    <w:p/>
+    <w:p/>
+    <w:p/>
+    <w:p>
+      <w:pPr>
+        <w:pStyle w:val="Heading2"/>
+      </w:pPr>
+      <w:r>
+        <w:t>Detected bugs</w:t>
+      </w:r>
+    </w:p>
     <w:p>
       <w:pPr>
         <w:pStyle w:val="Heading3"/>
+      </w:pPr>
+      <w:r>
+        <w:t>Output data</w:t>
+      </w:r>
+    </w:p>
+    <w:p>
+      <w:pPr>
+        <w:pStyle w:val="Heading4"/>
+      </w:pPr>
+      <w:r>
+        <w:t>observation</w:t>
+      </w:r>
+    </w:p>
+    <w:p>
+      <w:pPr>
+        <w:ind w:left="1710"/>
+        <w:rPr>
+          <w:rFonts w:asciiTheme="majorBidi" w:hAnsiTheme="majorBidi" w:cstheme="majorBidi"/>
+        </w:rPr>
+      </w:pPr>
+      <w:r>
+        <w:rPr>
+          <w:rFonts w:asciiTheme="majorBidi" w:hAnsiTheme="majorBidi" w:cstheme="majorBidi"/>
+        </w:rPr>
+        <w:t>When the FIFO is full and the input write enable and read enable signals are both high the output becomes different from the expected output.</w:t>
+      </w:r>
+    </w:p>
+    <w:p>
+      <w:pPr>
+        <w:pStyle w:val="Heading4"/>
+      </w:pPr>
+      <w:r>
+        <w:t>Cause</w:t>
+      </w:r>
+    </w:p>
+    <w:p>
+      <w:pPr>
+        <w:ind w:left="1710"/>
+        <w:rPr>
+          <w:rFonts w:asciiTheme="majorBidi" w:hAnsiTheme="majorBidi" w:cstheme="majorBidi"/>
+        </w:rPr>
       </w:pPr>
       <w:r>
         <w:rPr>
           <w:noProof/>
         </w:rPr>
         <w:drawing>
-          <wp:anchor distT="0" distB="0" distL="114300" distR="114300" simplePos="0" relativeHeight="251683840" behindDoc="0" locked="0" layoutInCell="1" allowOverlap="1" wp14:anchorId="4D329A8A" wp14:editId="688049EC">
+          <wp:anchor distT="0" distB="0" distL="114300" distR="114300" simplePos="0" relativeHeight="251695104" behindDoc="0" locked="0" layoutInCell="1" allowOverlap="1" wp14:anchorId="1292DCA9" wp14:editId="36DDDAB1">
             <wp:simplePos x="0" y="0"/>
             <wp:positionH relativeFrom="margin">
-              <wp:align>center</wp:align>
+              <wp:posOffset>1536700</wp:posOffset>
             </wp:positionH>
             <wp:positionV relativeFrom="paragraph">
-              <wp:posOffset>308899</wp:posOffset>
+              <wp:posOffset>1248410</wp:posOffset>
             </wp:positionV>
-            <wp:extent cx="3475170" cy="4932622"/>
-            <wp:effectExtent l="0" t="0" r="0" b="1905"/>
+            <wp:extent cx="4480784" cy="1054100"/>
+            <wp:effectExtent l="0" t="0" r="0" b="0"/>
             <wp:wrapNone/>
-            <wp:docPr id="1370731543" name="Picture 1"/>
+            <wp:docPr id="2140510567" name="Picture 1"/>
             <wp:cNvGraphicFramePr>
               <a:graphicFrameLocks xmlns:a="http://schemas.openxmlformats.org/drawingml/2006/main" noChangeAspect="1"/>
             </wp:cNvGraphicFramePr>
@@ -1020,11 +1388,11 @@
               <a:graphicData uri="http://schemas.openxmlformats.org/drawingml/2006/picture">
                 <pic:pic xmlns:pic="http://schemas.openxmlformats.org/drawingml/2006/picture">
                   <pic:nvPicPr>
-                    <pic:cNvPr id="1370731543" name=""/>
+                    <pic:cNvPr id="2140510567" name=""/>
                     <pic:cNvPicPr/>
                   </pic:nvPicPr>
                   <pic:blipFill>
-                    <a:blip r:embed="rId17"/>
+                    <a:blip r:embed="rId23"/>
                     <a:stretch>
                       <a:fillRect/>
                     </a:stretch>
@@ -1032,7 +1400,7 @@
                   <pic:spPr>
                     <a:xfrm>
                       <a:off x="0" y="0"/>
-                      <a:ext cx="3475170" cy="4932622"/>
+                      <a:ext cx="4480784" cy="1054100"/>
                     </a:xfrm>
                     <a:prstGeom prst="rect">
                       <a:avLst/>
@@ -1051,46 +1419,57 @@
         </w:drawing>
       </w:r>
       <w:r>
-        <w:t>UVM monitor</w:t>
-      </w:r>
-    </w:p>
-    <w:p/>
-    <w:p/>
-    <w:p/>
-    <w:p/>
-    <w:p/>
-    <w:p/>
-    <w:p/>
-    <w:p/>
-    <w:p/>
-    <w:p/>
-    <w:p/>
-    <w:p/>
-    <w:p/>
-    <w:p/>
-    <w:p/>
-    <w:p/>
-    <w:p>
-      <w:pPr>
-        <w:pStyle w:val="Heading3"/>
+        <w:rPr>
+          <w:rFonts w:asciiTheme="majorBidi" w:hAnsiTheme="majorBidi" w:cstheme="majorBidi"/>
+        </w:rPr>
+        <w:t>This scenario is not considered when updating the FIFO's internal counter. When both write and read enables are high, the counter value remains unchanged, rather than decrementing by one—even though only a read operation should be effectively counted in that case.</w:t>
+      </w:r>
+      <w:r>
+        <w:rPr>
+          <w:rFonts w:asciiTheme="majorBidi" w:hAnsiTheme="majorBidi" w:cstheme="majorBidi"/>
+        </w:rPr>
+        <w:t xml:space="preserve"> </w:t>
+      </w:r>
+      <w:r>
+        <w:rPr>
+          <w:rFonts w:asciiTheme="majorBidi" w:hAnsiTheme="majorBidi" w:cstheme="majorBidi"/>
+        </w:rPr>
+        <w:t>Similarly, when the FIFO is empty and both read and write enables are high, the counter value remains zero instead of incrementing by one, even though only a write operation should be considered in this situation.</w:t>
+      </w:r>
+    </w:p>
+    <w:p/>
+    <w:p/>
+    <w:p>
+      <w:pPr>
+        <w:ind w:left="0"/>
+      </w:pPr>
+    </w:p>
+    <w:p>
+      <w:pPr>
+        <w:ind w:left="0"/>
+      </w:pPr>
+    </w:p>
+    <w:p>
+      <w:pPr>
+        <w:pStyle w:val="Heading4"/>
       </w:pPr>
       <w:r>
         <w:rPr>
           <w:noProof/>
         </w:rPr>
         <w:drawing>
-          <wp:anchor distT="0" distB="0" distL="114300" distR="114300" simplePos="0" relativeHeight="251685888" behindDoc="0" locked="0" layoutInCell="1" allowOverlap="1" wp14:anchorId="0706D32A" wp14:editId="169D427E">
+          <wp:anchor distT="0" distB="0" distL="114300" distR="114300" simplePos="0" relativeHeight="251697152" behindDoc="0" locked="0" layoutInCell="1" allowOverlap="1" wp14:anchorId="7CE02364" wp14:editId="3AE75A49">
             <wp:simplePos x="0" y="0"/>
-            <wp:positionH relativeFrom="page">
-              <wp:align>center</wp:align>
+            <wp:positionH relativeFrom="column">
+              <wp:posOffset>1436496</wp:posOffset>
             </wp:positionH>
             <wp:positionV relativeFrom="paragraph">
-              <wp:posOffset>289469</wp:posOffset>
+              <wp:posOffset>286385</wp:posOffset>
             </wp:positionV>
-            <wp:extent cx="3099195" cy="1937657"/>
-            <wp:effectExtent l="0" t="0" r="6350" b="5715"/>
+            <wp:extent cx="4622800" cy="1274370"/>
+            <wp:effectExtent l="0" t="0" r="6350" b="2540"/>
             <wp:wrapNone/>
-            <wp:docPr id="141565756" name="Picture 1"/>
+            <wp:docPr id="214926354" name="Picture 1"/>
             <wp:cNvGraphicFramePr>
               <a:graphicFrameLocks xmlns:a="http://schemas.openxmlformats.org/drawingml/2006/main" noChangeAspect="1"/>
             </wp:cNvGraphicFramePr>
@@ -1098,11 +1477,11 @@
               <a:graphicData uri="http://schemas.openxmlformats.org/drawingml/2006/picture">
                 <pic:pic xmlns:pic="http://schemas.openxmlformats.org/drawingml/2006/picture">
                   <pic:nvPicPr>
-                    <pic:cNvPr id="141565756" name=""/>
+                    <pic:cNvPr id="214926354" name=""/>
                     <pic:cNvPicPr/>
                   </pic:nvPicPr>
                   <pic:blipFill>
-                    <a:blip r:embed="rId18"/>
+                    <a:blip r:embed="rId24"/>
                     <a:stretch>
                       <a:fillRect/>
                     </a:stretch>
@@ -1110,7 +1489,7 @@
                   <pic:spPr>
                     <a:xfrm>
                       <a:off x="0" y="0"/>
-                      <a:ext cx="3099195" cy="1937657"/>
+                      <a:ext cx="4622800" cy="1274370"/>
                     </a:xfrm>
                     <a:prstGeom prst="rect">
                       <a:avLst/>
@@ -1129,12 +1508,9 @@
         </w:drawing>
       </w:r>
       <w:r>
-        <w:t>Configuration object</w:t>
-      </w:r>
-    </w:p>
-    <w:p/>
-    <w:p/>
-    <w:p/>
+        <w:t>FIX</w:t>
+      </w:r>
+    </w:p>
     <w:p/>
     <w:p/>
     <w:p/>
@@ -1142,9 +1518,43 @@
     <w:p>
       <w:pPr>
         <w:pStyle w:val="Heading3"/>
-      </w:pPr>
-      <w:r>
-        <w:t>SVA file</w:t>
+        <w:numPr>
+          <w:ilvl w:val="0"/>
+          <w:numId w:val="0"/>
+        </w:numPr>
+        <w:ind w:left="1170"/>
+      </w:pPr>
+    </w:p>
+    <w:p>
+      <w:pPr>
+        <w:pStyle w:val="Heading3"/>
+      </w:pPr>
+      <w:r>
+        <w:t>Under flow signal</w:t>
+      </w:r>
+    </w:p>
+    <w:p>
+      <w:pPr>
+        <w:pStyle w:val="Heading4"/>
+      </w:pPr>
+      <w:r>
+        <w:t>Observation</w:t>
+      </w:r>
+    </w:p>
+    <w:p>
+      <w:pPr>
+        <w:ind w:left="1710"/>
+      </w:pPr>
+      <w:r>
+        <w:t>Under flow signal is driven computationally not sequentially</w:t>
+      </w:r>
+    </w:p>
+    <w:p>
+      <w:pPr>
+        <w:pStyle w:val="Heading4"/>
+      </w:pPr>
+      <w:r>
+        <w:t>Error code</w:t>
       </w:r>
     </w:p>
     <w:p>
@@ -1153,18 +1563,18 @@
           <w:noProof/>
         </w:rPr>
         <w:drawing>
-          <wp:anchor distT="0" distB="0" distL="114300" distR="114300" simplePos="0" relativeHeight="251687936" behindDoc="0" locked="0" layoutInCell="1" allowOverlap="1" wp14:anchorId="4C6D4BD0" wp14:editId="180236FE">
+          <wp:anchor distT="0" distB="0" distL="114300" distR="114300" simplePos="0" relativeHeight="251699200" behindDoc="0" locked="0" layoutInCell="1" allowOverlap="1" wp14:anchorId="24D663CD" wp14:editId="46B38C97">
             <wp:simplePos x="0" y="0"/>
             <wp:positionH relativeFrom="column">
-              <wp:posOffset>0</wp:posOffset>
+              <wp:posOffset>985520</wp:posOffset>
             </wp:positionH>
             <wp:positionV relativeFrom="paragraph">
-              <wp:posOffset>-635</wp:posOffset>
+              <wp:posOffset>170180</wp:posOffset>
             </wp:positionV>
-            <wp:extent cx="6629400" cy="5627370"/>
-            <wp:effectExtent l="0" t="0" r="0" b="0"/>
+            <wp:extent cx="5349240" cy="1272750"/>
+            <wp:effectExtent l="0" t="0" r="3810" b="3810"/>
             <wp:wrapNone/>
-            <wp:docPr id="1838196190" name="Picture 1"/>
+            <wp:docPr id="880464175" name="Picture 1"/>
             <wp:cNvGraphicFramePr>
               <a:graphicFrameLocks xmlns:a="http://schemas.openxmlformats.org/drawingml/2006/main" noChangeAspect="1"/>
             </wp:cNvGraphicFramePr>
@@ -1172,11 +1582,11 @@
               <a:graphicData uri="http://schemas.openxmlformats.org/drawingml/2006/picture">
                 <pic:pic xmlns:pic="http://schemas.openxmlformats.org/drawingml/2006/picture">
                   <pic:nvPicPr>
-                    <pic:cNvPr id="1838196190" name=""/>
+                    <pic:cNvPr id="880464175" name=""/>
                     <pic:cNvPicPr/>
                   </pic:nvPicPr>
                   <pic:blipFill>
-                    <a:blip r:embed="rId19"/>
+                    <a:blip r:embed="rId25"/>
                     <a:stretch>
                       <a:fillRect/>
                     </a:stretch>
@@ -1184,154 +1594,7 @@
                   <pic:spPr>
                     <a:xfrm>
                       <a:off x="0" y="0"/>
-                      <a:ext cx="6629400" cy="5627370"/>
-                    </a:xfrm>
-                    <a:prstGeom prst="rect">
-                      <a:avLst/>
-                    </a:prstGeom>
-                  </pic:spPr>
-                </pic:pic>
-              </a:graphicData>
-            </a:graphic>
-          </wp:anchor>
-        </w:drawing>
-      </w:r>
-    </w:p>
-    <w:p/>
-    <w:p/>
-    <w:p/>
-    <w:p/>
-    <w:p/>
-    <w:p/>
-    <w:p/>
-    <w:p/>
-    <w:p/>
-    <w:p/>
-    <w:p/>
-    <w:p/>
-    <w:p/>
-    <w:p/>
-    <w:p/>
-    <w:p/>
-    <w:p/>
-    <w:p/>
-    <w:p>
-      <w:pPr>
-        <w:ind w:firstLine="720"/>
-      </w:pPr>
-    </w:p>
-    <w:p>
-      <w:pPr>
-        <w:ind w:firstLine="720"/>
-      </w:pPr>
-    </w:p>
-    <w:p>
-      <w:pPr>
-        <w:ind w:firstLine="720"/>
-      </w:pPr>
-    </w:p>
-    <w:p>
-      <w:pPr>
-        <w:ind w:firstLine="720"/>
-      </w:pPr>
-      <w:r>
-        <w:rPr>
-          <w:noProof/>
-        </w:rPr>
-        <w:drawing>
-          <wp:anchor distT="0" distB="0" distL="114300" distR="114300" simplePos="0" relativeHeight="251689984" behindDoc="0" locked="0" layoutInCell="1" allowOverlap="1" wp14:anchorId="13B2152D" wp14:editId="31E30DCE">
-            <wp:simplePos x="0" y="0"/>
-            <wp:positionH relativeFrom="column">
-              <wp:posOffset>0</wp:posOffset>
-            </wp:positionH>
-            <wp:positionV relativeFrom="paragraph">
-              <wp:posOffset>0</wp:posOffset>
-            </wp:positionV>
-            <wp:extent cx="6629400" cy="3788410"/>
-            <wp:effectExtent l="0" t="0" r="0" b="2540"/>
-            <wp:wrapNone/>
-            <wp:docPr id="1344735743" name="Picture 1"/>
-            <wp:cNvGraphicFramePr>
-              <a:graphicFrameLocks xmlns:a="http://schemas.openxmlformats.org/drawingml/2006/main" noChangeAspect="1"/>
-            </wp:cNvGraphicFramePr>
-            <a:graphic xmlns:a="http://schemas.openxmlformats.org/drawingml/2006/main">
-              <a:graphicData uri="http://schemas.openxmlformats.org/drawingml/2006/picture">
-                <pic:pic xmlns:pic="http://schemas.openxmlformats.org/drawingml/2006/picture">
-                  <pic:nvPicPr>
-                    <pic:cNvPr id="1344735743" name=""/>
-                    <pic:cNvPicPr/>
-                  </pic:nvPicPr>
-                  <pic:blipFill>
-                    <a:blip r:embed="rId20"/>
-                    <a:stretch>
-                      <a:fillRect/>
-                    </a:stretch>
-                  </pic:blipFill>
-                  <pic:spPr>
-                    <a:xfrm>
-                      <a:off x="0" y="0"/>
-                      <a:ext cx="6629400" cy="3788410"/>
-                    </a:xfrm>
-                    <a:prstGeom prst="rect">
-                      <a:avLst/>
-                    </a:prstGeom>
-                  </pic:spPr>
-                </pic:pic>
-              </a:graphicData>
-            </a:graphic>
-          </wp:anchor>
-        </w:drawing>
-      </w:r>
-    </w:p>
-    <w:p/>
-    <w:p/>
-    <w:p/>
-    <w:p/>
-    <w:p/>
-    <w:p/>
-    <w:p/>
-    <w:p/>
-    <w:p/>
-    <w:p/>
-    <w:p/>
-    <w:p>
-      <w:r>
-        <w:rPr>
-          <w:noProof/>
-        </w:rPr>
-        <w:drawing>
-          <wp:anchor distT="0" distB="0" distL="114300" distR="114300" simplePos="0" relativeHeight="251692032" behindDoc="0" locked="0" layoutInCell="1" allowOverlap="1" wp14:anchorId="2EF7CCDC" wp14:editId="4A21C723">
-            <wp:simplePos x="0" y="0"/>
-            <wp:positionH relativeFrom="margin">
-              <wp:align>center</wp:align>
-            </wp:positionH>
-            <wp:positionV relativeFrom="paragraph">
-              <wp:posOffset>266094</wp:posOffset>
-            </wp:positionV>
-            <wp:extent cx="4913443" cy="5298894"/>
-            <wp:effectExtent l="0" t="0" r="1905" b="0"/>
-            <wp:wrapNone/>
-            <wp:docPr id="211182581" name="Picture 1"/>
-            <wp:cNvGraphicFramePr>
-              <a:graphicFrameLocks xmlns:a="http://schemas.openxmlformats.org/drawingml/2006/main" noChangeAspect="1"/>
-            </wp:cNvGraphicFramePr>
-            <a:graphic xmlns:a="http://schemas.openxmlformats.org/drawingml/2006/main">
-              <a:graphicData uri="http://schemas.openxmlformats.org/drawingml/2006/picture">
-                <pic:pic xmlns:pic="http://schemas.openxmlformats.org/drawingml/2006/picture">
-                  <pic:nvPicPr>
-                    <pic:cNvPr id="211182581" name=""/>
-                    <pic:cNvPicPr/>
-                  </pic:nvPicPr>
-                  <pic:blipFill>
-                    <a:blip r:embed="rId21"/>
-                    <a:stretch>
-                      <a:fillRect/>
-                    </a:stretch>
-                  </pic:blipFill>
-                  <pic:spPr>
-                    <a:xfrm>
-                      <a:off x="0" y="0"/>
-                      <a:ext cx="4913443" cy="5298894"/>
+                      <a:ext cx="5349240" cy="1272750"/>
                     </a:xfrm>
                     <a:prstGeom prst="rect">
                       <a:avLst/>
@@ -1351,44 +1614,99 @@
       </w:r>
     </w:p>
     <w:p/>
-    <w:p/>
-    <w:p/>
-    <w:p/>
-    <w:p/>
-    <w:p/>
-    <w:p/>
-    <w:p/>
-    <w:p/>
-    <w:p/>
-    <w:p/>
-    <w:p/>
-    <w:p/>
-    <w:p/>
-    <w:p/>
-    <w:p/>
-    <w:p/>
-    <w:p/>
-    <w:p>
-      <w:pPr>
-        <w:pStyle w:val="Heading3"/>
+    <w:p>
+      <w:r>
+        <w:rPr>
+          <w:noProof/>
+        </w:rPr>
+        <mc:AlternateContent>
+          <mc:Choice Requires="wps">
+            <w:drawing>
+              <wp:anchor distT="0" distB="0" distL="114300" distR="114300" simplePos="0" relativeHeight="251702272" behindDoc="0" locked="0" layoutInCell="1" allowOverlap="1" wp14:anchorId="0E45AD39" wp14:editId="0BC1923D">
+                <wp:simplePos x="0" y="0"/>
+                <wp:positionH relativeFrom="column">
+                  <wp:posOffset>467360</wp:posOffset>
+                </wp:positionH>
+                <wp:positionV relativeFrom="paragraph">
+                  <wp:posOffset>156210</wp:posOffset>
+                </wp:positionV>
+                <wp:extent cx="1082040" cy="0"/>
+                <wp:effectExtent l="0" t="114300" r="0" b="133350"/>
+                <wp:wrapNone/>
+                <wp:docPr id="661567641" name="Straight Arrow Connector 3"/>
+                <wp:cNvGraphicFramePr/>
+                <a:graphic xmlns:a="http://schemas.openxmlformats.org/drawingml/2006/main">
+                  <a:graphicData uri="http://schemas.microsoft.com/office/word/2010/wordprocessingShape">
+                    <wps:wsp>
+                      <wps:cNvCnPr/>
+                      <wps:spPr>
+                        <a:xfrm>
+                          <a:off x="0" y="0"/>
+                          <a:ext cx="1082040" cy="0"/>
+                        </a:xfrm>
+                        <a:prstGeom prst="straightConnector1">
+                          <a:avLst/>
+                        </a:prstGeom>
+                        <a:ln w="57150">
+                          <a:tailEnd type="triangle"/>
+                        </a:ln>
+                      </wps:spPr>
+                      <wps:style>
+                        <a:lnRef idx="2">
+                          <a:schemeClr val="accent3"/>
+                        </a:lnRef>
+                        <a:fillRef idx="0">
+                          <a:schemeClr val="accent3"/>
+                        </a:fillRef>
+                        <a:effectRef idx="1">
+                          <a:schemeClr val="accent3"/>
+                        </a:effectRef>
+                        <a:fontRef idx="minor">
+                          <a:schemeClr val="tx1"/>
+                        </a:fontRef>
+                      </wps:style>
+                      <wps:bodyPr/>
+                    </wps:wsp>
+                  </a:graphicData>
+                </a:graphic>
+              </wp:anchor>
+            </w:drawing>
+          </mc:Choice>
+          <mc:Fallback>
+            <w:pict>
+              <v:shape w14:anchorId="1026575B" id="Straight Arrow Connector 3" o:spid="_x0000_s1026" type="#_x0000_t32" style="position:absolute;left:0;text-align:left;margin-left:36.8pt;margin-top:12.3pt;width:85.2pt;height:0;z-index:251702272;visibility:visible;mso-wrap-style:square;mso-wrap-distance-left:9pt;mso-wrap-distance-top:0;mso-wrap-distance-right:9pt;mso-wrap-distance-bottom:0;mso-position-horizontal:absolute;mso-position-horizontal-relative:text;mso-position-vertical:absolute;mso-position-vertical-relative:text" o:gfxdata="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" strokecolor="#196b24 [3206]" strokeweight="4.5pt">
+                <v:stroke endarrow="block" joinstyle="miter"/>
+              </v:shape>
+            </w:pict>
+          </mc:Fallback>
+        </mc:AlternateContent>
+      </w:r>
+    </w:p>
+    <w:p/>
+    <w:p/>
+    <w:p/>
+    <w:p/>
+    <w:p>
+      <w:pPr>
+        <w:pStyle w:val="Heading4"/>
       </w:pPr>
       <w:r>
         <w:rPr>
           <w:noProof/>
         </w:rPr>
         <w:drawing>
-          <wp:anchor distT="0" distB="0" distL="114300" distR="114300" simplePos="0" relativeHeight="251694080" behindDoc="0" locked="0" layoutInCell="1" allowOverlap="1" wp14:anchorId="6F3CA4F2" wp14:editId="765C449F">
+          <wp:anchor distT="0" distB="0" distL="114300" distR="114300" simplePos="0" relativeHeight="251701248" behindDoc="0" locked="0" layoutInCell="1" allowOverlap="1" wp14:anchorId="33E55D2B" wp14:editId="25062D5A">
             <wp:simplePos x="0" y="0"/>
             <wp:positionH relativeFrom="margin">
               <wp:align>center</wp:align>
             </wp:positionH>
             <wp:positionV relativeFrom="paragraph">
-              <wp:posOffset>235585</wp:posOffset>
+              <wp:posOffset>258445</wp:posOffset>
             </wp:positionV>
-            <wp:extent cx="1561769" cy="2367643"/>
-            <wp:effectExtent l="0" t="0" r="635" b="0"/>
+            <wp:extent cx="3738880" cy="1780946"/>
+            <wp:effectExtent l="0" t="0" r="0" b="0"/>
             <wp:wrapNone/>
-            <wp:docPr id="479463586" name="Picture 1"/>
+            <wp:docPr id="2036153701" name="Picture 1"/>
             <wp:cNvGraphicFramePr>
               <a:graphicFrameLocks xmlns:a="http://schemas.openxmlformats.org/drawingml/2006/main" noChangeAspect="1"/>
             </wp:cNvGraphicFramePr>
@@ -1396,11 +1714,11 @@
               <a:graphicData uri="http://schemas.openxmlformats.org/drawingml/2006/picture">
                 <pic:pic xmlns:pic="http://schemas.openxmlformats.org/drawingml/2006/picture">
                   <pic:nvPicPr>
-                    <pic:cNvPr id="479463586" name=""/>
+                    <pic:cNvPr id="2036153701" name=""/>
                     <pic:cNvPicPr/>
                   </pic:nvPicPr>
                   <pic:blipFill>
-                    <a:blip r:embed="rId22"/>
+                    <a:blip r:embed="rId26"/>
                     <a:stretch>
                       <a:fillRect/>
                     </a:stretch>
@@ -1408,7 +1726,7 @@
                   <pic:spPr>
                     <a:xfrm>
                       <a:off x="0" y="0"/>
-                      <a:ext cx="1561769" cy="2367643"/>
+                      <a:ext cx="3738880" cy="1780946"/>
                     </a:xfrm>
                     <a:prstGeom prst="rect">
                       <a:avLst/>
@@ -1426,21 +1744,81 @@
           </wp:anchor>
         </w:drawing>
       </w:r>
-      <w:proofErr w:type="spellStart"/>
-      <w:r>
-        <w:t>Src</w:t>
-      </w:r>
-      <w:proofErr w:type="spellEnd"/>
-      <w:r>
-        <w:t xml:space="preserve"> list</w:t>
-      </w:r>
-    </w:p>
-    <w:p/>
-    <w:p/>
-    <w:p/>
-    <w:p/>
-    <w:p/>
-    <w:p/>
+      <w:r>
+        <w:t>FIX</w:t>
+      </w:r>
+    </w:p>
+    <w:p/>
+    <w:p/>
+    <w:p/>
+    <w:p>
+      <w:r>
+        <w:rPr>
+          <w:noProof/>
+        </w:rPr>
+        <mc:AlternateContent>
+          <mc:Choice Requires="wps">
+            <w:drawing>
+              <wp:anchor distT="0" distB="0" distL="114300" distR="114300" simplePos="0" relativeHeight="251704320" behindDoc="0" locked="0" layoutInCell="1" allowOverlap="1" wp14:anchorId="2B1AB402" wp14:editId="60796821">
+                <wp:simplePos x="0" y="0"/>
+                <wp:positionH relativeFrom="column">
+                  <wp:posOffset>919480</wp:posOffset>
+                </wp:positionH>
+                <wp:positionV relativeFrom="paragraph">
+                  <wp:posOffset>283845</wp:posOffset>
+                </wp:positionV>
+                <wp:extent cx="1082040" cy="0"/>
+                <wp:effectExtent l="0" t="114300" r="0" b="133350"/>
+                <wp:wrapNone/>
+                <wp:docPr id="2093245688" name="Straight Arrow Connector 3"/>
+                <wp:cNvGraphicFramePr/>
+                <a:graphic xmlns:a="http://schemas.openxmlformats.org/drawingml/2006/main">
+                  <a:graphicData uri="http://schemas.microsoft.com/office/word/2010/wordprocessingShape">
+                    <wps:wsp>
+                      <wps:cNvCnPr/>
+                      <wps:spPr>
+                        <a:xfrm>
+                          <a:off x="0" y="0"/>
+                          <a:ext cx="1082040" cy="0"/>
+                        </a:xfrm>
+                        <a:prstGeom prst="straightConnector1">
+                          <a:avLst/>
+                        </a:prstGeom>
+                        <a:ln w="57150">
+                          <a:tailEnd type="triangle"/>
+                        </a:ln>
+                      </wps:spPr>
+                      <wps:style>
+                        <a:lnRef idx="2">
+                          <a:schemeClr val="accent3"/>
+                        </a:lnRef>
+                        <a:fillRef idx="0">
+                          <a:schemeClr val="accent3"/>
+                        </a:fillRef>
+                        <a:effectRef idx="1">
+                          <a:schemeClr val="accent3"/>
+                        </a:effectRef>
+                        <a:fontRef idx="minor">
+                          <a:schemeClr val="tx1"/>
+                        </a:fontRef>
+                      </wps:style>
+                      <wps:bodyPr/>
+                    </wps:wsp>
+                  </a:graphicData>
+                </a:graphic>
+              </wp:anchor>
+            </w:drawing>
+          </mc:Choice>
+          <mc:Fallback>
+            <w:pict>
+              <v:shape w14:anchorId="2DDA8785" id="Straight Arrow Connector 3" o:spid="_x0000_s1026" type="#_x0000_t32" style="position:absolute;left:0;text-align:left;margin-left:72.4pt;margin-top:22.35pt;width:85.2pt;height:0;z-index:251704320;visibility:visible;mso-wrap-style:square;mso-wrap-distance-left:9pt;mso-wrap-distance-top:0;mso-wrap-distance-right:9pt;mso-wrap-distance-bottom:0;mso-position-horizontal:absolute;mso-position-horizontal-relative:text;mso-position-vertical:absolute;mso-position-vertical-relative:text" o:gfxdata="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" strokecolor="#196b24 [3206]" strokeweight="4.5pt">
+                <v:stroke endarrow="block" joinstyle="miter"/>
+              </v:shape>
+            </w:pict>
+          </mc:Fallback>
+        </mc:AlternateContent>
+      </w:r>
+    </w:p>
     <w:p/>
     <w:p/>
     <w:p>
@@ -1448,27 +1826,56 @@
         <w:pStyle w:val="Heading3"/>
       </w:pPr>
       <w:r>
-        <w:t>Do file</w:t>
-      </w:r>
-    </w:p>
-    <w:p>
+        <w:t>Almost full signal</w:t>
+      </w:r>
+    </w:p>
+    <w:p>
+      <w:pPr>
+        <w:pStyle w:val="Heading4"/>
+      </w:pPr>
+      <w:r>
+        <w:t>Observation</w:t>
+      </w:r>
+    </w:p>
+    <w:p>
+      <w:pPr>
+        <w:ind w:left="1710"/>
+      </w:pPr>
+      <w:r>
+        <w:t xml:space="preserve">It was found that the </w:t>
+      </w:r>
+      <w:r>
+        <w:rPr>
+          <w:i/>
+          <w:iCs/>
+        </w:rPr>
+        <w:t>almost full</w:t>
+      </w:r>
+      <w:r>
+        <w:t xml:space="preserve"> signal is asserted one entry earlier than expected. When the FIFO still has two available slots, the signal is raised instead of waiting until only one slot remains before becoming full.</w:t>
+      </w:r>
+    </w:p>
+    <w:p>
+      <w:pPr>
+        <w:pStyle w:val="Heading4"/>
+      </w:pPr>
       <w:r>
         <w:rPr>
           <w:noProof/>
         </w:rPr>
         <w:drawing>
-          <wp:anchor distT="0" distB="0" distL="114300" distR="114300" simplePos="0" relativeHeight="251696128" behindDoc="0" locked="0" layoutInCell="1" allowOverlap="1" wp14:anchorId="2B1146AC" wp14:editId="79B3E44F">
+          <wp:anchor distT="0" distB="0" distL="114300" distR="114300" simplePos="0" relativeHeight="251706368" behindDoc="0" locked="0" layoutInCell="1" allowOverlap="1" wp14:anchorId="7F01F145" wp14:editId="4E7DDBDC">
             <wp:simplePos x="0" y="0"/>
-            <wp:positionH relativeFrom="margin">
-              <wp:align>center</wp:align>
+            <wp:positionH relativeFrom="column">
+              <wp:posOffset>1109980</wp:posOffset>
             </wp:positionH>
             <wp:positionV relativeFrom="paragraph">
-              <wp:posOffset>4627</wp:posOffset>
+              <wp:posOffset>327025</wp:posOffset>
             </wp:positionV>
-            <wp:extent cx="4343400" cy="1401620"/>
-            <wp:effectExtent l="0" t="0" r="0" b="8255"/>
+            <wp:extent cx="4724615" cy="1005840"/>
+            <wp:effectExtent l="0" t="0" r="0" b="3810"/>
             <wp:wrapNone/>
-            <wp:docPr id="1367753537" name="Picture 1"/>
+            <wp:docPr id="2049345557" name="Picture 1"/>
             <wp:cNvGraphicFramePr>
               <a:graphicFrameLocks xmlns:a="http://schemas.openxmlformats.org/drawingml/2006/main" noChangeAspect="1"/>
             </wp:cNvGraphicFramePr>
@@ -1476,11 +1883,11 @@
               <a:graphicData uri="http://schemas.openxmlformats.org/drawingml/2006/picture">
                 <pic:pic xmlns:pic="http://schemas.openxmlformats.org/drawingml/2006/picture">
                   <pic:nvPicPr>
-                    <pic:cNvPr id="1367753537" name=""/>
+                    <pic:cNvPr id="2049345557" name=""/>
                     <pic:cNvPicPr/>
                   </pic:nvPicPr>
                   <pic:blipFill>
-                    <a:blip r:embed="rId23"/>
+                    <a:blip r:embed="rId27"/>
                     <a:stretch>
                       <a:fillRect/>
                     </a:stretch>
@@ -1488,7 +1895,7 @@
                   <pic:spPr>
                     <a:xfrm>
                       <a:off x="0" y="0"/>
-                      <a:ext cx="4343400" cy="1401620"/>
+                      <a:ext cx="4724615" cy="1005840"/>
                     </a:xfrm>
                     <a:prstGeom prst="rect">
                       <a:avLst/>
@@ -1506,36 +1913,185 @@
           </wp:anchor>
         </w:drawing>
       </w:r>
-    </w:p>
-    <w:p/>
-    <w:p/>
-    <w:p/>
-    <w:p>
-      <w:pPr>
-        <w:ind w:left="0"/>
-      </w:pPr>
-    </w:p>
-    <w:p>
-      <w:pPr>
-        <w:pStyle w:val="Heading3"/>
-      </w:pPr>
+      <w:r>
+        <w:t>Error in the code</w:t>
+      </w:r>
+    </w:p>
+    <w:p>
+      <w:pPr>
+        <w:tabs>
+          <w:tab w:val="left" w:pos="2120"/>
+        </w:tabs>
+      </w:pPr>
+      <w:r>
+        <w:rPr>
+          <w:noProof/>
+        </w:rPr>
+        <mc:AlternateContent>
+          <mc:Choice Requires="wps">
+            <w:drawing>
+              <wp:anchor distT="0" distB="0" distL="114300" distR="114300" simplePos="0" relativeHeight="251708416" behindDoc="0" locked="0" layoutInCell="1" allowOverlap="1" wp14:anchorId="0061C42F" wp14:editId="045AF2B6">
+                <wp:simplePos x="0" y="0"/>
+                <wp:positionH relativeFrom="column">
+                  <wp:posOffset>513080</wp:posOffset>
+                </wp:positionH>
+                <wp:positionV relativeFrom="paragraph">
+                  <wp:posOffset>650875</wp:posOffset>
+                </wp:positionV>
+                <wp:extent cx="1082040" cy="0"/>
+                <wp:effectExtent l="0" t="114300" r="0" b="133350"/>
+                <wp:wrapNone/>
+                <wp:docPr id="561935805" name="Straight Arrow Connector 3"/>
+                <wp:cNvGraphicFramePr/>
+                <a:graphic xmlns:a="http://schemas.openxmlformats.org/drawingml/2006/main">
+                  <a:graphicData uri="http://schemas.microsoft.com/office/word/2010/wordprocessingShape">
+                    <wps:wsp>
+                      <wps:cNvCnPr/>
+                      <wps:spPr>
+                        <a:xfrm>
+                          <a:off x="0" y="0"/>
+                          <a:ext cx="1082040" cy="0"/>
+                        </a:xfrm>
+                        <a:prstGeom prst="straightConnector1">
+                          <a:avLst/>
+                        </a:prstGeom>
+                        <a:ln w="57150">
+                          <a:tailEnd type="triangle"/>
+                        </a:ln>
+                      </wps:spPr>
+                      <wps:style>
+                        <a:lnRef idx="2">
+                          <a:schemeClr val="accent3"/>
+                        </a:lnRef>
+                        <a:fillRef idx="0">
+                          <a:schemeClr val="accent3"/>
+                        </a:fillRef>
+                        <a:effectRef idx="1">
+                          <a:schemeClr val="accent3"/>
+                        </a:effectRef>
+                        <a:fontRef idx="minor">
+                          <a:schemeClr val="tx1"/>
+                        </a:fontRef>
+                      </wps:style>
+                      <wps:bodyPr/>
+                    </wps:wsp>
+                  </a:graphicData>
+                </a:graphic>
+              </wp:anchor>
+            </w:drawing>
+          </mc:Choice>
+          <mc:Fallback>
+            <w:pict>
+              <v:shape w14:anchorId="6962A6E1" id="Straight Arrow Connector 3" o:spid="_x0000_s1026" type="#_x0000_t32" style="position:absolute;left:0;text-align:left;margin-left:40.4pt;margin-top:51.25pt;width:85.2pt;height:0;z-index:251708416;visibility:visible;mso-wrap-style:square;mso-wrap-distance-left:9pt;mso-wrap-distance-top:0;mso-wrap-distance-right:9pt;mso-wrap-distance-bottom:0;mso-position-horizontal:absolute;mso-position-horizontal-relative:text;mso-position-vertical:absolute;mso-position-vertical-relative:text" o:gfxdata="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" strokecolor="#196b24 [3206]" strokeweight="4.5pt">
+                <v:stroke endarrow="block" joinstyle="miter"/>
+              </v:shape>
+            </w:pict>
+          </mc:Fallback>
+        </mc:AlternateContent>
+      </w:r>
+      <w:r>
+        <w:tab/>
+      </w:r>
+    </w:p>
+    <w:p/>
+    <w:p/>
+    <w:p>
+      <w:pPr>
+        <w:ind w:firstLine="720"/>
+      </w:pPr>
+    </w:p>
+    <w:p>
+      <w:pPr>
+        <w:pStyle w:val="Heading4"/>
+      </w:pPr>
+      <w:r>
+        <w:t>FIX</w:t>
+      </w:r>
+    </w:p>
+    <w:p>
+      <w:r>
+        <w:rPr>
+          <w:noProof/>
+        </w:rPr>
+        <mc:AlternateContent>
+          <mc:Choice Requires="wps">
+            <w:drawing>
+              <wp:anchor distT="0" distB="0" distL="114300" distR="114300" simplePos="0" relativeHeight="251712512" behindDoc="0" locked="0" layoutInCell="1" allowOverlap="1" wp14:anchorId="729545A4" wp14:editId="352412AC">
+                <wp:simplePos x="0" y="0"/>
+                <wp:positionH relativeFrom="column">
+                  <wp:posOffset>543560</wp:posOffset>
+                </wp:positionH>
+                <wp:positionV relativeFrom="paragraph">
+                  <wp:posOffset>496570</wp:posOffset>
+                </wp:positionV>
+                <wp:extent cx="1082040" cy="0"/>
+                <wp:effectExtent l="0" t="114300" r="0" b="133350"/>
+                <wp:wrapNone/>
+                <wp:docPr id="196170247" name="Straight Arrow Connector 3"/>
+                <wp:cNvGraphicFramePr/>
+                <a:graphic xmlns:a="http://schemas.openxmlformats.org/drawingml/2006/main">
+                  <a:graphicData uri="http://schemas.microsoft.com/office/word/2010/wordprocessingShape">
+                    <wps:wsp>
+                      <wps:cNvCnPr/>
+                      <wps:spPr>
+                        <a:xfrm>
+                          <a:off x="0" y="0"/>
+                          <a:ext cx="1082040" cy="0"/>
+                        </a:xfrm>
+                        <a:prstGeom prst="straightConnector1">
+                          <a:avLst/>
+                        </a:prstGeom>
+                        <a:ln w="57150">
+                          <a:tailEnd type="triangle"/>
+                        </a:ln>
+                      </wps:spPr>
+                      <wps:style>
+                        <a:lnRef idx="2">
+                          <a:schemeClr val="accent3"/>
+                        </a:lnRef>
+                        <a:fillRef idx="0">
+                          <a:schemeClr val="accent3"/>
+                        </a:fillRef>
+                        <a:effectRef idx="1">
+                          <a:schemeClr val="accent3"/>
+                        </a:effectRef>
+                        <a:fontRef idx="minor">
+                          <a:schemeClr val="tx1"/>
+                        </a:fontRef>
+                      </wps:style>
+                      <wps:bodyPr/>
+                    </wps:wsp>
+                  </a:graphicData>
+                </a:graphic>
+              </wp:anchor>
+            </w:drawing>
+          </mc:Choice>
+          <mc:Fallback>
+            <w:pict>
+              <v:shape w14:anchorId="3BF2A08F" id="Straight Arrow Connector 3" o:spid="_x0000_s1026" type="#_x0000_t32" style="position:absolute;left:0;text-align:left;margin-left:42.8pt;margin-top:39.1pt;width:85.2pt;height:0;z-index:251712512;visibility:visible;mso-wrap-style:square;mso-wrap-distance-left:9pt;mso-wrap-distance-top:0;mso-wrap-distance-right:9pt;mso-wrap-distance-bottom:0;mso-position-horizontal:absolute;mso-position-horizontal-relative:text;mso-position-vertical:absolute;mso-position-vertical-relative:text" o:gfxdata="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" strokecolor="#196b24 [3206]" strokeweight="4.5pt">
+                <v:stroke endarrow="block" joinstyle="miter"/>
+              </v:shape>
+            </w:pict>
+          </mc:Fallback>
+        </mc:AlternateContent>
+      </w:r>
       <w:r>
         <w:rPr>
           <w:noProof/>
         </w:rPr>
         <w:drawing>
-          <wp:anchor distT="0" distB="0" distL="114300" distR="114300" simplePos="0" relativeHeight="251698176" behindDoc="0" locked="0" layoutInCell="1" allowOverlap="1" wp14:anchorId="4A583AD1" wp14:editId="1035C8CD">
+          <wp:anchor distT="0" distB="0" distL="114300" distR="114300" simplePos="0" relativeHeight="251710464" behindDoc="0" locked="0" layoutInCell="1" allowOverlap="1" wp14:anchorId="6C4B4295" wp14:editId="70F5B669">
             <wp:simplePos x="0" y="0"/>
             <wp:positionH relativeFrom="column">
-              <wp:posOffset>271145</wp:posOffset>
+              <wp:posOffset>1117600</wp:posOffset>
             </wp:positionH>
             <wp:positionV relativeFrom="paragraph">
-              <wp:posOffset>302260</wp:posOffset>
+              <wp:posOffset>19685</wp:posOffset>
             </wp:positionV>
-            <wp:extent cx="5932170" cy="4462780"/>
-            <wp:effectExtent l="0" t="0" r="0" b="0"/>
+            <wp:extent cx="4805680" cy="836703"/>
+            <wp:effectExtent l="0" t="0" r="0" b="1905"/>
             <wp:wrapNone/>
-            <wp:docPr id="445983323" name="Picture 1"/>
+            <wp:docPr id="1197875415" name="Picture 1"/>
             <wp:cNvGraphicFramePr>
               <a:graphicFrameLocks xmlns:a="http://schemas.openxmlformats.org/drawingml/2006/main" noChangeAspect="1"/>
             </wp:cNvGraphicFramePr>
@@ -1543,11 +2099,11 @@
               <a:graphicData uri="http://schemas.openxmlformats.org/drawingml/2006/picture">
                 <pic:pic xmlns:pic="http://schemas.openxmlformats.org/drawingml/2006/picture">
                   <pic:nvPicPr>
-                    <pic:cNvPr id="445983323" name=""/>
+                    <pic:cNvPr id="1197875415" name=""/>
                     <pic:cNvPicPr/>
                   </pic:nvPicPr>
                   <pic:blipFill>
-                    <a:blip r:embed="rId24"/>
+                    <a:blip r:embed="rId28"/>
                     <a:stretch>
                       <a:fillRect/>
                     </a:stretch>
@@ -1555,7 +2111,7 @@
                   <pic:spPr>
                     <a:xfrm>
                       <a:off x="0" y="0"/>
-                      <a:ext cx="5932170" cy="4462780"/>
+                      <a:ext cx="4805680" cy="836703"/>
                     </a:xfrm>
                     <a:prstGeom prst="rect">
                       <a:avLst/>
@@ -1573,23 +2129,7 @@
           </wp:anchor>
         </w:drawing>
       </w:r>
-      <w:r>
-        <w:t>Simulation results</w:t>
-      </w:r>
-    </w:p>
-    <w:p/>
-    <w:p/>
-    <w:p/>
-    <w:p/>
-    <w:p/>
-    <w:p/>
-    <w:p/>
-    <w:p/>
-    <w:p/>
-    <w:p/>
-    <w:p/>
-    <w:p/>
-    <w:p/>
+    </w:p>
     <w:p/>
     <w:p/>
     <w:p>
@@ -1597,13 +2137,91 @@
         <w:pStyle w:val="Heading3"/>
       </w:pPr>
       <w:r>
-        <w:t>A</w:t>
-      </w:r>
-      <w:r>
-        <w:t>ssertion</w:t>
-      </w:r>
-      <w:r>
-        <w:t xml:space="preserve"> results</w:t>
+        <w:t>Top resetting</w:t>
+      </w:r>
+    </w:p>
+    <w:p>
+      <w:pPr>
+        <w:pStyle w:val="Heading4"/>
+      </w:pPr>
+      <w:r>
+        <w:t>Observation</w:t>
+      </w:r>
+    </w:p>
+    <w:p>
+      <w:pPr>
+        <w:ind w:left="1710"/>
+      </w:pPr>
+      <w:r>
+        <w:t>The registered outputs are not reset when the reset signal is asserted</w:t>
+      </w:r>
+      <w:r>
+        <w:t>, it remains unchanged.</w:t>
+      </w:r>
+    </w:p>
+    <w:p>
+      <w:pPr>
+        <w:pStyle w:val="Heading4"/>
+      </w:pPr>
+      <w:r>
+        <w:t>Fix</w:t>
+      </w:r>
+    </w:p>
+    <w:p>
+      <w:pPr>
+        <w:ind w:left="1710"/>
+      </w:pPr>
+      <w:r>
+        <w:t xml:space="preserve">Reset output registered signals which are </w:t>
+      </w:r>
+      <w:proofErr w:type="spellStart"/>
+      <w:r>
+        <w:t>data_out</w:t>
+      </w:r>
+      <w:proofErr w:type="spellEnd"/>
+      <w:r>
+        <w:t xml:space="preserve">, </w:t>
+      </w:r>
+      <w:proofErr w:type="spellStart"/>
+      <w:r>
+        <w:t>wr_ack</w:t>
+      </w:r>
+      <w:proofErr w:type="spellEnd"/>
+      <w:r>
+        <w:t>, overflow, underflow.</w:t>
+      </w:r>
+    </w:p>
+    <w:p>
+      <w:pPr>
+        <w:ind w:left="1710"/>
+      </w:pPr>
+    </w:p>
+    <w:p>
+      <w:pPr>
+        <w:ind w:left="1710"/>
+      </w:pPr>
+    </w:p>
+    <w:p>
+      <w:pPr>
+        <w:ind w:left="1710"/>
+      </w:pPr>
+    </w:p>
+    <w:p>
+      <w:pPr>
+        <w:ind w:left="1710"/>
+      </w:pPr>
+    </w:p>
+    <w:p>
+      <w:pPr>
+        <w:ind w:left="0"/>
+      </w:pPr>
+    </w:p>
+    <w:p>
+      <w:pPr>
+        <w:pStyle w:val="Heading2"/>
+      </w:pPr>
+      <w:r>
+        <w:t>Correct design</w:t>
       </w:r>
     </w:p>
     <w:p>
@@ -1612,7 +2230,7 @@
           <w:noProof/>
         </w:rPr>
         <w:drawing>
-          <wp:anchor distT="0" distB="0" distL="114300" distR="114300" simplePos="0" relativeHeight="251700224" behindDoc="0" locked="0" layoutInCell="1" allowOverlap="1" wp14:anchorId="0B692076" wp14:editId="5B0F0C88">
+          <wp:anchor distT="0" distB="0" distL="114300" distR="114300" simplePos="0" relativeHeight="251714560" behindDoc="0" locked="0" layoutInCell="1" allowOverlap="1" wp14:anchorId="19BF4EE5" wp14:editId="5B425C3D">
             <wp:simplePos x="0" y="0"/>
             <wp:positionH relativeFrom="column">
               <wp:posOffset>0</wp:posOffset>
@@ -1620,10 +2238,10 @@
             <wp:positionV relativeFrom="paragraph">
               <wp:posOffset>-635</wp:posOffset>
             </wp:positionV>
-            <wp:extent cx="6629400" cy="3232150"/>
-            <wp:effectExtent l="0" t="0" r="0" b="6350"/>
+            <wp:extent cx="6629400" cy="9150985"/>
+            <wp:effectExtent l="0" t="0" r="0" b="0"/>
             <wp:wrapNone/>
-            <wp:docPr id="1315159497" name="Picture 1"/>
+            <wp:docPr id="39634820" name="Picture 1"/>
             <wp:cNvGraphicFramePr>
               <a:graphicFrameLocks xmlns:a="http://schemas.openxmlformats.org/drawingml/2006/main" noChangeAspect="1"/>
             </wp:cNvGraphicFramePr>
@@ -1631,11 +2249,11 @@
               <a:graphicData uri="http://schemas.openxmlformats.org/drawingml/2006/picture">
                 <pic:pic xmlns:pic="http://schemas.openxmlformats.org/drawingml/2006/picture">
                   <pic:nvPicPr>
-                    <pic:cNvPr id="1315159497" name=""/>
+                    <pic:cNvPr id="39634820" name=""/>
                     <pic:cNvPicPr/>
                   </pic:nvPicPr>
                   <pic:blipFill>
-                    <a:blip r:embed="rId25"/>
+                    <a:blip r:embed="rId29"/>
                     <a:stretch>
                       <a:fillRect/>
                     </a:stretch>
@@ -1643,7 +2261,7 @@
                   <pic:spPr>
                     <a:xfrm>
                       <a:off x="0" y="0"/>
-                      <a:ext cx="6629400" cy="3232150"/>
+                      <a:ext cx="6629400" cy="9150985"/>
                     </a:xfrm>
                     <a:prstGeom prst="rect">
                       <a:avLst/>
@@ -1656,42 +2274,172 @@
         </w:drawing>
       </w:r>
     </w:p>
-    <w:p/>
-    <w:p/>
-    <w:p/>
-    <w:p/>
-    <w:p/>
-    <w:p/>
-    <w:p/>
-    <w:p/>
-    <w:p/>
-    <w:p/>
-    <w:p>
-      <w:pPr>
-        <w:pStyle w:val="Heading3"/>
-      </w:pPr>
-      <w:r>
-        <w:t>Assertion coverage</w:t>
-      </w:r>
-    </w:p>
-    <w:p>
+    <w:p>
+      <w:pPr>
+        <w:ind w:left="1710"/>
+      </w:pPr>
+    </w:p>
+    <w:p>
+      <w:pPr>
+        <w:ind w:left="1710"/>
+      </w:pPr>
+    </w:p>
+    <w:p>
+      <w:pPr>
+        <w:ind w:left="1710"/>
+      </w:pPr>
+    </w:p>
+    <w:p>
+      <w:pPr>
+        <w:ind w:left="1710"/>
+      </w:pPr>
+    </w:p>
+    <w:p>
+      <w:pPr>
+        <w:ind w:left="1710"/>
+      </w:pPr>
+    </w:p>
+    <w:p>
+      <w:pPr>
+        <w:ind w:left="1710"/>
+      </w:pPr>
+    </w:p>
+    <w:p>
+      <w:pPr>
+        <w:ind w:left="1710"/>
+      </w:pPr>
+    </w:p>
+    <w:p>
+      <w:pPr>
+        <w:ind w:left="1710"/>
+      </w:pPr>
+    </w:p>
+    <w:p>
+      <w:pPr>
+        <w:ind w:left="1710"/>
+      </w:pPr>
+    </w:p>
+    <w:p>
+      <w:pPr>
+        <w:ind w:left="1710"/>
+      </w:pPr>
+    </w:p>
+    <w:p>
+      <w:pPr>
+        <w:ind w:left="1710"/>
+      </w:pPr>
+    </w:p>
+    <w:p>
+      <w:pPr>
+        <w:ind w:left="1710"/>
+      </w:pPr>
+    </w:p>
+    <w:p>
+      <w:pPr>
+        <w:ind w:left="1710"/>
+      </w:pPr>
+    </w:p>
+    <w:p>
+      <w:pPr>
+        <w:ind w:left="1710"/>
+      </w:pPr>
+    </w:p>
+    <w:p>
+      <w:pPr>
+        <w:ind w:left="1710"/>
+      </w:pPr>
+    </w:p>
+    <w:p>
+      <w:pPr>
+        <w:ind w:left="1710"/>
+      </w:pPr>
+    </w:p>
+    <w:p>
+      <w:pPr>
+        <w:ind w:left="1710"/>
+      </w:pPr>
+    </w:p>
+    <w:p>
+      <w:pPr>
+        <w:ind w:left="1710"/>
+      </w:pPr>
+    </w:p>
+    <w:p>
+      <w:pPr>
+        <w:ind w:left="1710"/>
+      </w:pPr>
+    </w:p>
+    <w:p>
+      <w:pPr>
+        <w:ind w:left="1710"/>
+      </w:pPr>
+    </w:p>
+    <w:p>
+      <w:pPr>
+        <w:ind w:left="1710"/>
+      </w:pPr>
+    </w:p>
+    <w:p>
+      <w:pPr>
+        <w:ind w:left="1710"/>
+      </w:pPr>
+    </w:p>
+    <w:p>
+      <w:pPr>
+        <w:ind w:left="1710"/>
+      </w:pPr>
+    </w:p>
+    <w:p>
+      <w:pPr>
+        <w:ind w:left="1710"/>
+      </w:pPr>
+    </w:p>
+    <w:p>
+      <w:pPr>
+        <w:ind w:left="1710"/>
+      </w:pPr>
+    </w:p>
+    <w:p>
+      <w:pPr>
+        <w:ind w:left="1710"/>
+      </w:pPr>
+    </w:p>
+    <w:p>
+      <w:pPr>
+        <w:ind w:left="1710"/>
+      </w:pPr>
+    </w:p>
+    <w:p>
+      <w:pPr>
+        <w:ind w:left="1710"/>
+      </w:pPr>
+    </w:p>
+    <w:p>
+      <w:pPr>
+        <w:ind w:left="1710"/>
+      </w:pPr>
+    </w:p>
+    <w:p>
+      <w:pPr>
+        <w:ind w:left="1710"/>
+      </w:pPr>
       <w:r>
         <w:rPr>
           <w:noProof/>
         </w:rPr>
         <w:drawing>
-          <wp:anchor distT="0" distB="0" distL="114300" distR="114300" simplePos="0" relativeHeight="251702272" behindDoc="0" locked="0" layoutInCell="1" allowOverlap="1" wp14:anchorId="366673BE" wp14:editId="13732242">
+          <wp:anchor distT="0" distB="0" distL="114300" distR="114300" simplePos="0" relativeHeight="251718656" behindDoc="0" locked="0" layoutInCell="1" allowOverlap="1" wp14:anchorId="6474A9F2" wp14:editId="78242D4C">
             <wp:simplePos x="0" y="0"/>
-            <wp:positionH relativeFrom="column">
-              <wp:posOffset>0</wp:posOffset>
+            <wp:positionH relativeFrom="margin">
+              <wp:align>left</wp:align>
             </wp:positionH>
             <wp:positionV relativeFrom="paragraph">
-              <wp:posOffset>0</wp:posOffset>
+              <wp:posOffset>6397625</wp:posOffset>
             </wp:positionV>
-            <wp:extent cx="6629400" cy="1974215"/>
-            <wp:effectExtent l="0" t="0" r="0" b="6985"/>
+            <wp:extent cx="4282440" cy="2542391"/>
+            <wp:effectExtent l="0" t="0" r="3810" b="0"/>
             <wp:wrapNone/>
-            <wp:docPr id="1495868882" name="Picture 1"/>
+            <wp:docPr id="1455164786" name="Picture 1"/>
             <wp:cNvGraphicFramePr>
               <a:graphicFrameLocks xmlns:a="http://schemas.openxmlformats.org/drawingml/2006/main" noChangeAspect="1"/>
             </wp:cNvGraphicFramePr>
@@ -1699,11 +2447,11 @@
               <a:graphicData uri="http://schemas.openxmlformats.org/drawingml/2006/picture">
                 <pic:pic xmlns:pic="http://schemas.openxmlformats.org/drawingml/2006/picture">
                   <pic:nvPicPr>
-                    <pic:cNvPr id="1495868882" name=""/>
+                    <pic:cNvPr id="1455164786" name=""/>
                     <pic:cNvPicPr/>
                   </pic:nvPicPr>
                   <pic:blipFill>
-                    <a:blip r:embed="rId26"/>
+                    <a:blip r:embed="rId30"/>
                     <a:stretch>
                       <a:fillRect/>
                     </a:stretch>
@@ -1711,66 +2459,7 @@
                   <pic:spPr>
                     <a:xfrm>
                       <a:off x="0" y="0"/>
-                      <a:ext cx="6629400" cy="1974215"/>
-                    </a:xfrm>
-                    <a:prstGeom prst="rect">
-                      <a:avLst/>
-                    </a:prstGeom>
-                  </pic:spPr>
-                </pic:pic>
-              </a:graphicData>
-            </a:graphic>
-          </wp:anchor>
-        </w:drawing>
-      </w:r>
-    </w:p>
-    <w:p/>
-    <w:p/>
-    <w:p/>
-    <w:p/>
-    <w:p/>
-    <w:p/>
-    <w:p>
-      <w:pPr>
-        <w:pStyle w:val="Heading3"/>
-      </w:pPr>
-      <w:r>
-        <w:rPr>
-          <w:noProof/>
-        </w:rPr>
-        <w:drawing>
-          <wp:anchor distT="0" distB="0" distL="114300" distR="114300" simplePos="0" relativeHeight="251704320" behindDoc="0" locked="0" layoutInCell="1" allowOverlap="1" wp14:anchorId="0C48C99A" wp14:editId="601EA68E">
-            <wp:simplePos x="0" y="0"/>
-            <wp:positionH relativeFrom="margin">
-              <wp:align>center</wp:align>
-            </wp:positionH>
-            <wp:positionV relativeFrom="paragraph">
-              <wp:posOffset>251913</wp:posOffset>
-            </wp:positionV>
-            <wp:extent cx="6237514" cy="3132499"/>
-            <wp:effectExtent l="0" t="0" r="0" b="0"/>
-            <wp:wrapNone/>
-            <wp:docPr id="1973934132" name="Picture 1"/>
-            <wp:cNvGraphicFramePr>
-              <a:graphicFrameLocks xmlns:a="http://schemas.openxmlformats.org/drawingml/2006/main" noChangeAspect="1"/>
-            </wp:cNvGraphicFramePr>
-            <a:graphic xmlns:a="http://schemas.openxmlformats.org/drawingml/2006/main">
-              <a:graphicData uri="http://schemas.openxmlformats.org/drawingml/2006/picture">
-                <pic:pic xmlns:pic="http://schemas.openxmlformats.org/drawingml/2006/picture">
-                  <pic:nvPicPr>
-                    <pic:cNvPr id="1973934132" name=""/>
-                    <pic:cNvPicPr/>
-                  </pic:nvPicPr>
-                  <pic:blipFill>
-                    <a:blip r:embed="rId27"/>
-                    <a:stretch>
-                      <a:fillRect/>
-                    </a:stretch>
-                  </pic:blipFill>
-                  <pic:spPr>
-                    <a:xfrm>
-                      <a:off x="0" y="0"/>
-                      <a:ext cx="6237514" cy="3132499"/>
+                      <a:ext cx="4282440" cy="2542391"/>
                     </a:xfrm>
                     <a:prstGeom prst="rect">
                       <a:avLst/>
@@ -1789,48 +2478,22 @@
         </w:drawing>
       </w:r>
       <w:r>
-        <w:t>Functional coverage</w:t>
-      </w:r>
-    </w:p>
-    <w:p/>
-    <w:p/>
-    <w:p/>
-    <w:p/>
-    <w:p/>
-    <w:p/>
-    <w:p/>
-    <w:p/>
-    <w:p/>
-    <w:p/>
-    <w:p>
-      <w:pPr>
-        <w:pStyle w:val="Heading3"/>
-      </w:pPr>
-      <w:r>
-        <w:t>Code coverage</w:t>
-      </w:r>
-    </w:p>
-    <w:p>
-      <w:pPr>
-        <w:pStyle w:val="Heading4"/>
-      </w:pPr>
-      <w:r>
         <w:rPr>
           <w:noProof/>
         </w:rPr>
         <w:drawing>
-          <wp:anchor distT="0" distB="0" distL="114300" distR="114300" simplePos="0" relativeHeight="251706368" behindDoc="0" locked="0" layoutInCell="1" allowOverlap="1" wp14:anchorId="29418EED" wp14:editId="3B797816">
+          <wp:anchor distT="0" distB="0" distL="114300" distR="114300" simplePos="0" relativeHeight="251716608" behindDoc="0" locked="0" layoutInCell="1" allowOverlap="1" wp14:anchorId="499475B1" wp14:editId="5F73D18E">
             <wp:simplePos x="0" y="0"/>
-            <wp:positionH relativeFrom="margin">
-              <wp:align>center</wp:align>
+            <wp:positionH relativeFrom="column">
+              <wp:posOffset>0</wp:posOffset>
             </wp:positionH>
             <wp:positionV relativeFrom="paragraph">
-              <wp:posOffset>249011</wp:posOffset>
+              <wp:posOffset>0</wp:posOffset>
             </wp:positionV>
-            <wp:extent cx="4757057" cy="1593432"/>
-            <wp:effectExtent l="0" t="0" r="5715" b="6985"/>
+            <wp:extent cx="6629400" cy="6395085"/>
+            <wp:effectExtent l="0" t="0" r="0" b="5715"/>
             <wp:wrapNone/>
-            <wp:docPr id="1745713250" name="Picture 1"/>
+            <wp:docPr id="371308122" name="Picture 1"/>
             <wp:cNvGraphicFramePr>
               <a:graphicFrameLocks xmlns:a="http://schemas.openxmlformats.org/drawingml/2006/main" noChangeAspect="1"/>
             </wp:cNvGraphicFramePr>
@@ -1838,11 +2501,11 @@
               <a:graphicData uri="http://schemas.openxmlformats.org/drawingml/2006/picture">
                 <pic:pic xmlns:pic="http://schemas.openxmlformats.org/drawingml/2006/picture">
                   <pic:nvPicPr>
-                    <pic:cNvPr id="1745713250" name=""/>
+                    <pic:cNvPr id="371308122" name=""/>
                     <pic:cNvPicPr/>
                   </pic:nvPicPr>
                   <pic:blipFill>
-                    <a:blip r:embed="rId28"/>
+                    <a:blip r:embed="rId31"/>
                     <a:stretch>
                       <a:fillRect/>
                     </a:stretch>
@@ -1850,7 +2513,105 @@
                   <pic:spPr>
                     <a:xfrm>
                       <a:off x="0" y="0"/>
-                      <a:ext cx="4757057" cy="1593432"/>
+                      <a:ext cx="6629400" cy="6395085"/>
+                    </a:xfrm>
+                    <a:prstGeom prst="rect">
+                      <a:avLst/>
+                    </a:prstGeom>
+                  </pic:spPr>
+                </pic:pic>
+              </a:graphicData>
+            </a:graphic>
+          </wp:anchor>
+        </w:drawing>
+      </w:r>
+    </w:p>
+    <w:p/>
+    <w:p/>
+    <w:p/>
+    <w:p/>
+    <w:p/>
+    <w:p/>
+    <w:p/>
+    <w:p/>
+    <w:p/>
+    <w:p/>
+    <w:p/>
+    <w:p/>
+    <w:p/>
+    <w:p/>
+    <w:p/>
+    <w:p/>
+    <w:p/>
+    <w:p/>
+    <w:p/>
+    <w:p/>
+    <w:p/>
+    <w:p/>
+    <w:p/>
+    <w:p/>
+    <w:p/>
+    <w:p/>
+    <w:p/>
+    <w:p/>
+    <w:p>
+      <w:pPr>
+        <w:tabs>
+          <w:tab w:val="left" w:pos="2280"/>
+        </w:tabs>
+      </w:pPr>
+      <w:r>
+        <w:tab/>
+      </w:r>
+    </w:p>
+    <w:p>
+      <w:pPr>
+        <w:tabs>
+          <w:tab w:val="left" w:pos="2280"/>
+        </w:tabs>
+      </w:pPr>
+    </w:p>
+    <w:p>
+      <w:pPr>
+        <w:pStyle w:val="Heading2"/>
+      </w:pPr>
+      <w:r>
+        <w:rPr>
+          <w:noProof/>
+        </w:rPr>
+        <w:drawing>
+          <wp:anchor distT="0" distB="0" distL="114300" distR="114300" simplePos="0" relativeHeight="251720704" behindDoc="0" locked="0" layoutInCell="1" allowOverlap="1" wp14:anchorId="68E7AC20" wp14:editId="23AC3EF1">
+            <wp:simplePos x="0" y="0"/>
+            <wp:positionH relativeFrom="margin">
+              <wp:posOffset>1362075</wp:posOffset>
+            </wp:positionH>
+            <wp:positionV relativeFrom="paragraph">
+              <wp:posOffset>316865</wp:posOffset>
+            </wp:positionV>
+            <wp:extent cx="3901440" cy="1050917"/>
+            <wp:effectExtent l="0" t="0" r="3810" b="0"/>
+            <wp:wrapNone/>
+            <wp:docPr id="1948421124" name="Picture 1"/>
+            <wp:cNvGraphicFramePr>
+              <a:graphicFrameLocks xmlns:a="http://schemas.openxmlformats.org/drawingml/2006/main" noChangeAspect="1"/>
+            </wp:cNvGraphicFramePr>
+            <a:graphic xmlns:a="http://schemas.openxmlformats.org/drawingml/2006/main">
+              <a:graphicData uri="http://schemas.openxmlformats.org/drawingml/2006/picture">
+                <pic:pic xmlns:pic="http://schemas.openxmlformats.org/drawingml/2006/picture">
+                  <pic:nvPicPr>
+                    <pic:cNvPr id="1948421124" name=""/>
+                    <pic:cNvPicPr/>
+                  </pic:nvPicPr>
+                  <pic:blipFill>
+                    <a:blip r:embed="rId32"/>
+                    <a:stretch>
+                      <a:fillRect/>
+                    </a:stretch>
+                  </pic:blipFill>
+                  <pic:spPr>
+                    <a:xfrm>
+                      <a:off x="0" y="0"/>
+                      <a:ext cx="3901440" cy="1050917"/>
                     </a:xfrm>
                     <a:prstGeom prst="rect">
                       <a:avLst/>
@@ -1869,35 +2630,30 @@
         </w:drawing>
       </w:r>
       <w:r>
-        <w:t>Branch</w:t>
-      </w:r>
-    </w:p>
-    <w:p/>
-    <w:p/>
-    <w:p/>
-    <w:p/>
-    <w:p/>
-    <w:p>
-      <w:pPr>
-        <w:pStyle w:val="Heading4"/>
-      </w:pPr>
+        <w:t>Simulation results after modification</w:t>
+      </w:r>
+    </w:p>
+    <w:p/>
+    <w:p/>
+    <w:p/>
+    <w:p>
       <w:r>
         <w:rPr>
           <w:noProof/>
         </w:rPr>
         <w:drawing>
-          <wp:anchor distT="0" distB="0" distL="114300" distR="114300" simplePos="0" relativeHeight="251708416" behindDoc="0" locked="0" layoutInCell="1" allowOverlap="1" wp14:anchorId="30DCF37A" wp14:editId="2C0771A2">
+          <wp:anchor distT="0" distB="0" distL="114300" distR="114300" simplePos="0" relativeHeight="251722752" behindDoc="0" locked="0" layoutInCell="1" allowOverlap="1" wp14:anchorId="585F74A5" wp14:editId="799BD882">
             <wp:simplePos x="0" y="0"/>
-            <wp:positionH relativeFrom="page">
+            <wp:positionH relativeFrom="margin">
               <wp:align>center</wp:align>
             </wp:positionH>
             <wp:positionV relativeFrom="paragraph">
-              <wp:posOffset>315142</wp:posOffset>
+              <wp:posOffset>135890</wp:posOffset>
             </wp:positionV>
-            <wp:extent cx="5029200" cy="1251519"/>
-            <wp:effectExtent l="0" t="0" r="0" b="6350"/>
+            <wp:extent cx="4231640" cy="1482290"/>
+            <wp:effectExtent l="0" t="0" r="0" b="3810"/>
             <wp:wrapNone/>
-            <wp:docPr id="1420703499" name="Picture 1"/>
+            <wp:docPr id="1913641866" name="Picture 1"/>
             <wp:cNvGraphicFramePr>
               <a:graphicFrameLocks xmlns:a="http://schemas.openxmlformats.org/drawingml/2006/main" noChangeAspect="1"/>
             </wp:cNvGraphicFramePr>
@@ -1905,11 +2661,11 @@
               <a:graphicData uri="http://schemas.openxmlformats.org/drawingml/2006/picture">
                 <pic:pic xmlns:pic="http://schemas.openxmlformats.org/drawingml/2006/picture">
                   <pic:nvPicPr>
-                    <pic:cNvPr id="1420703499" name=""/>
+                    <pic:cNvPr id="1913641866" name=""/>
                     <pic:cNvPicPr/>
                   </pic:nvPicPr>
                   <pic:blipFill>
-                    <a:blip r:embed="rId29"/>
+                    <a:blip r:embed="rId33"/>
                     <a:stretch>
                       <a:fillRect/>
                     </a:stretch>
@@ -1917,7 +2673,7 @@
                   <pic:spPr>
                     <a:xfrm>
                       <a:off x="0" y="0"/>
-                      <a:ext cx="5029200" cy="1251519"/>
+                      <a:ext cx="4231640" cy="1482290"/>
                     </a:xfrm>
                     <a:prstGeom prst="rect">
                       <a:avLst/>
@@ -1935,35 +2691,67 @@
           </wp:anchor>
         </w:drawing>
       </w:r>
-      <w:r>
-        <w:t xml:space="preserve">Statement </w:t>
-      </w:r>
-    </w:p>
-    <w:p/>
-    <w:p/>
-    <w:p/>
-    <w:p/>
-    <w:p>
-      <w:pPr>
-        <w:pStyle w:val="Heading4"/>
-      </w:pPr>
+    </w:p>
+    <w:p>
+      <w:pPr>
+        <w:pStyle w:val="Heading2"/>
+        <w:numPr>
+          <w:ilvl w:val="0"/>
+          <w:numId w:val="0"/>
+        </w:numPr>
+        <w:tabs>
+          <w:tab w:val="left" w:pos="1976"/>
+        </w:tabs>
+      </w:pPr>
+    </w:p>
+    <w:p/>
+    <w:p/>
+    <w:p>
+      <w:pPr>
+        <w:rPr>
+          <w:rFonts w:asciiTheme="majorHAnsi" w:eastAsiaTheme="majorEastAsia" w:hAnsiTheme="majorHAnsi" w:cstheme="majorBidi"/>
+          <w:b/>
+          <w:bCs/>
+          <w:sz w:val="32"/>
+          <w:szCs w:val="32"/>
+          <w:u w:val="single"/>
+        </w:rPr>
+      </w:pPr>
+    </w:p>
+    <w:p>
+      <w:pPr>
+        <w:pStyle w:val="Heading2"/>
+      </w:pPr>
+      <w:r>
+        <w:t>Coverage results</w:t>
+      </w:r>
+    </w:p>
+    <w:p>
+      <w:pPr>
+        <w:pStyle w:val="Heading3"/>
+      </w:pPr>
+      <w:r>
+        <w:t>Code coverage</w:t>
+      </w:r>
+    </w:p>
+    <w:p>
       <w:r>
         <w:rPr>
           <w:noProof/>
         </w:rPr>
         <w:drawing>
-          <wp:anchor distT="0" distB="0" distL="114300" distR="114300" simplePos="0" relativeHeight="251710464" behindDoc="0" locked="0" layoutInCell="1" allowOverlap="1" wp14:anchorId="7875A0B5" wp14:editId="6E6A2039">
+          <wp:anchor distT="0" distB="0" distL="114300" distR="114300" simplePos="0" relativeHeight="251724800" behindDoc="0" locked="0" layoutInCell="1" allowOverlap="1" wp14:anchorId="3FDDA386" wp14:editId="059B787B">
             <wp:simplePos x="0" y="0"/>
-            <wp:positionH relativeFrom="page">
+            <wp:positionH relativeFrom="margin">
               <wp:align>center</wp:align>
             </wp:positionH>
             <wp:positionV relativeFrom="paragraph">
-              <wp:posOffset>281577</wp:posOffset>
+              <wp:posOffset>8890</wp:posOffset>
             </wp:positionV>
-            <wp:extent cx="5720443" cy="5562090"/>
-            <wp:effectExtent l="0" t="0" r="0" b="635"/>
+            <wp:extent cx="3992880" cy="1273973"/>
+            <wp:effectExtent l="0" t="0" r="7620" b="2540"/>
             <wp:wrapNone/>
-            <wp:docPr id="1242632664" name="Picture 1"/>
+            <wp:docPr id="1878811024" name="Picture 1"/>
             <wp:cNvGraphicFramePr>
               <a:graphicFrameLocks xmlns:a="http://schemas.openxmlformats.org/drawingml/2006/main" noChangeAspect="1"/>
             </wp:cNvGraphicFramePr>
@@ -1971,11 +2759,11 @@
               <a:graphicData uri="http://schemas.openxmlformats.org/drawingml/2006/picture">
                 <pic:pic xmlns:pic="http://schemas.openxmlformats.org/drawingml/2006/picture">
                   <pic:nvPicPr>
-                    <pic:cNvPr id="1242632664" name=""/>
+                    <pic:cNvPr id="1878811024" name=""/>
                     <pic:cNvPicPr/>
                   </pic:nvPicPr>
                   <pic:blipFill>
-                    <a:blip r:embed="rId30"/>
+                    <a:blip r:embed="rId34"/>
                     <a:stretch>
                       <a:fillRect/>
                     </a:stretch>
@@ -1983,7 +2771,7 @@
                   <pic:spPr>
                     <a:xfrm>
                       <a:off x="0" y="0"/>
-                      <a:ext cx="5720443" cy="5562090"/>
+                      <a:ext cx="3992880" cy="1273973"/>
                     </a:xfrm>
                     <a:prstGeom prst="rect">
                       <a:avLst/>
@@ -2001,8 +2789,137 @@
           </wp:anchor>
         </w:drawing>
       </w:r>
-      <w:r>
-        <w:t>Toggle coverage</w:t>
+    </w:p>
+    <w:p/>
+    <w:p/>
+    <w:p/>
+    <w:p>
+      <w:pPr>
+        <w:pStyle w:val="Heading3"/>
+      </w:pPr>
+      <w:r>
+        <w:rPr>
+          <w:noProof/>
+        </w:rPr>
+        <w:drawing>
+          <wp:anchor distT="0" distB="0" distL="114300" distR="114300" simplePos="0" relativeHeight="251726848" behindDoc="0" locked="0" layoutInCell="1" allowOverlap="1" wp14:anchorId="39863050" wp14:editId="610733C6">
+            <wp:simplePos x="0" y="0"/>
+            <wp:positionH relativeFrom="margin">
+              <wp:align>center</wp:align>
+            </wp:positionH>
+            <wp:positionV relativeFrom="paragraph">
+              <wp:posOffset>290195</wp:posOffset>
+            </wp:positionV>
+            <wp:extent cx="5130800" cy="1323491"/>
+            <wp:effectExtent l="0" t="0" r="0" b="0"/>
+            <wp:wrapNone/>
+            <wp:docPr id="2139433882" name="Picture 1"/>
+            <wp:cNvGraphicFramePr>
+              <a:graphicFrameLocks xmlns:a="http://schemas.openxmlformats.org/drawingml/2006/main" noChangeAspect="1"/>
+            </wp:cNvGraphicFramePr>
+            <a:graphic xmlns:a="http://schemas.openxmlformats.org/drawingml/2006/main">
+              <a:graphicData uri="http://schemas.openxmlformats.org/drawingml/2006/picture">
+                <pic:pic xmlns:pic="http://schemas.openxmlformats.org/drawingml/2006/picture">
+                  <pic:nvPicPr>
+                    <pic:cNvPr id="2139433882" name=""/>
+                    <pic:cNvPicPr/>
+                  </pic:nvPicPr>
+                  <pic:blipFill>
+                    <a:blip r:embed="rId35"/>
+                    <a:stretch>
+                      <a:fillRect/>
+                    </a:stretch>
+                  </pic:blipFill>
+                  <pic:spPr>
+                    <a:xfrm>
+                      <a:off x="0" y="0"/>
+                      <a:ext cx="5130800" cy="1323491"/>
+                    </a:xfrm>
+                    <a:prstGeom prst="rect">
+                      <a:avLst/>
+                    </a:prstGeom>
+                  </pic:spPr>
+                </pic:pic>
+              </a:graphicData>
+            </a:graphic>
+            <wp14:sizeRelH relativeFrom="margin">
+              <wp14:pctWidth>0</wp14:pctWidth>
+            </wp14:sizeRelH>
+            <wp14:sizeRelV relativeFrom="margin">
+              <wp14:pctHeight>0</wp14:pctHeight>
+            </wp14:sizeRelV>
+          </wp:anchor>
+        </w:drawing>
+      </w:r>
+      <w:r>
+        <w:t>Assertion coverage</w:t>
+      </w:r>
+    </w:p>
+    <w:p/>
+    <w:p/>
+    <w:p/>
+    <w:p/>
+    <w:p/>
+    <w:p>
+      <w:pPr>
+        <w:pStyle w:val="Heading3"/>
+      </w:pPr>
+      <w:r>
+        <w:rPr>
+          <w:noProof/>
+        </w:rPr>
+        <w:drawing>
+          <wp:anchor distT="0" distB="0" distL="114300" distR="114300" simplePos="0" relativeHeight="251728896" behindDoc="0" locked="0" layoutInCell="1" allowOverlap="1" wp14:anchorId="2A4AD76A" wp14:editId="5FEE89C7">
+            <wp:simplePos x="0" y="0"/>
+            <wp:positionH relativeFrom="margin">
+              <wp:align>center</wp:align>
+            </wp:positionH>
+            <wp:positionV relativeFrom="paragraph">
+              <wp:posOffset>313690</wp:posOffset>
+            </wp:positionV>
+            <wp:extent cx="4800600" cy="2355215"/>
+            <wp:effectExtent l="0" t="0" r="0" b="6985"/>
+            <wp:wrapNone/>
+            <wp:docPr id="1392554513" name="Picture 1"/>
+            <wp:cNvGraphicFramePr>
+              <a:graphicFrameLocks xmlns:a="http://schemas.openxmlformats.org/drawingml/2006/main" noChangeAspect="1"/>
+            </wp:cNvGraphicFramePr>
+            <a:graphic xmlns:a="http://schemas.openxmlformats.org/drawingml/2006/main">
+              <a:graphicData uri="http://schemas.openxmlformats.org/drawingml/2006/picture">
+                <pic:pic xmlns:pic="http://schemas.openxmlformats.org/drawingml/2006/picture">
+                  <pic:nvPicPr>
+                    <pic:cNvPr id="1392554513" name=""/>
+                    <pic:cNvPicPr/>
+                  </pic:nvPicPr>
+                  <pic:blipFill>
+                    <a:blip r:embed="rId36"/>
+                    <a:stretch>
+                      <a:fillRect/>
+                    </a:stretch>
+                  </pic:blipFill>
+                  <pic:spPr>
+                    <a:xfrm>
+                      <a:off x="0" y="0"/>
+                      <a:ext cx="4800600" cy="2355215"/>
+                    </a:xfrm>
+                    <a:prstGeom prst="rect">
+                      <a:avLst/>
+                    </a:prstGeom>
+                  </pic:spPr>
+                </pic:pic>
+              </a:graphicData>
+            </a:graphic>
+            <wp14:sizeRelH relativeFrom="margin">
+              <wp14:pctWidth>0</wp14:pctWidth>
+            </wp14:sizeRelH>
+            <wp14:sizeRelV relativeFrom="margin">
+              <wp14:pctHeight>0</wp14:pctHeight>
+            </wp14:sizeRelV>
+          </wp:anchor>
+        </w:drawing>
+      </w:r>
+      <w:r>
+        <w:t>Functional coverage</w:t>
       </w:r>
     </w:p>
     <w:p/>
@@ -3092,7 +4009,6 @@
   <w:style w:type="character" w:default="1" w:styleId="DefaultParagraphFont">
     <w:name w:val="Default Paragraph Font"/>
     <w:uiPriority w:val="1"/>
-    <w:semiHidden/>
     <w:unhideWhenUsed/>
   </w:style>
   <w:style w:type="table" w:default="1" w:styleId="TableNormal">
@@ -3431,6 +4347,24 @@
       <w:szCs w:val="18"/>
     </w:rPr>
   </w:style>
+  <w:style w:type="paragraph" w:styleId="NormalWeb">
+    <w:name w:val="Normal (Web)"/>
+    <w:basedOn w:val="Normal"/>
+    <w:uiPriority w:val="99"/>
+    <w:semiHidden/>
+    <w:unhideWhenUsed/>
+    <w:rsid w:val="00162FDD"/>
+    <w:pPr>
+      <w:spacing w:before="100" w:beforeAutospacing="1" w:after="100" w:afterAutospacing="1" w:line="240" w:lineRule="auto"/>
+      <w:ind w:left="0"/>
+    </w:pPr>
+    <w:rPr>
+      <w:rFonts w:ascii="Times New Roman" w:eastAsia="Times New Roman" w:hAnsi="Times New Roman" w:cs="Times New Roman"/>
+      <w:kern w:val="0"/>
+      <w:lang w:bidi="ar-SA"/>
+      <w14:ligatures w14:val="none"/>
+    </w:rPr>
+  </w:style>
 </w:styles>
 </file>
 
@@ -3747,4 +4681,16 @@
     </a:ext>
   </a:extLst>
 </a:theme>
+</file>
+
+<file path=customXml/item1.xml><?xml version="1.0" encoding="utf-8"?>
+<b:Sources xmlns:b="http://schemas.openxmlformats.org/officeDocument/2006/bibliography" xmlns="http://schemas.openxmlformats.org/officeDocument/2006/bibliography" SelectedStyle="\APASixthEditionOfficeOnline.xsl" StyleName="APA" Version="6"/>
+</file>
+
+<file path=customXml/itemProps1.xml><?xml version="1.0" encoding="utf-8"?>
+<ds:datastoreItem xmlns:ds="http://schemas.openxmlformats.org/officeDocument/2006/customXml" ds:itemID="{E9CB7EE0-2D00-4FAE-833C-8EFC630E3DCA}">
+  <ds:schemaRefs>
+    <ds:schemaRef ds:uri="http://schemas.openxmlformats.org/officeDocument/2006/bibliography"/>
+  </ds:schemaRefs>
+</ds:datastoreItem>
 </file>
</xml_diff>